<commit_message>
maj de la doc de la version 1.0.1
</commit_message>
<xml_diff>
--- a/plugin_maitre.docx
+++ b/plugin_maitre.docx
@@ -115,7 +115,17 @@
                 <w:sz w:val="44"/>
                 <w:szCs w:val="44"/>
               </w:rPr>
-              <w:t>Plugin Maitre v1.0.0</w:t>
+              <w:t>Plugin Maitre v1.0.</w:t>
+            </w:r>
+            <w:r>
+              <w:rPr>
+                <w:rFonts w:ascii="Times New Roman" w:hAnsi="Times New Roman" w:cs="Times New Roman"/>
+                <w:b/>
+                <w:noProof/>
+                <w:sz w:val="44"/>
+                <w:szCs w:val="44"/>
+              </w:rPr>
+              <w:t>1</w:t>
             </w:r>
           </w:p>
         </w:tc>
@@ -364,7 +374,15 @@
                     <w:b/>
                     <w:szCs w:val="18"/>
                   </w:rPr>
-                  <w:t>1.0.0</w:t>
+                  <w:t>1.0.</w:t>
+                </w:r>
+                <w:r>
+                  <w:rPr>
+                    <w:rFonts w:cs="Arial"/>
+                    <w:b/>
+                    <w:szCs w:val="18"/>
+                  </w:rPr>
+                  <w:t>1</w:t>
                 </w:r>
               </w:sdtContent>
             </w:sdt>
@@ -1093,6 +1111,94 @@
                 <w:szCs w:val="18"/>
               </w:rPr>
               <w:t xml:space="preserve">Création </w:t>
+            </w:r>
+          </w:p>
+        </w:tc>
+      </w:tr>
+      <w:tr>
+        <w:tc>
+          <w:tcPr>
+            <w:tcW w:w="1122" w:type="dxa"/>
+          </w:tcPr>
+          <w:p>
+            <w:pPr>
+              <w:ind w:firstLine="34"/>
+              <w:jc w:val="center"/>
+              <w:rPr>
+                <w:rFonts w:cs="Arial"/>
+                <w:szCs w:val="18"/>
+              </w:rPr>
+            </w:pPr>
+            <w:r>
+              <w:rPr>
+                <w:rFonts w:cs="Arial"/>
+                <w:szCs w:val="18"/>
+              </w:rPr>
+              <w:t>1.0.1</w:t>
+            </w:r>
+          </w:p>
+        </w:tc>
+        <w:tc>
+          <w:tcPr>
+            <w:tcW w:w="1400" w:type="dxa"/>
+          </w:tcPr>
+          <w:p>
+            <w:pPr>
+              <w:ind w:firstLine="0"/>
+              <w:jc w:val="center"/>
+              <w:rPr>
+                <w:rFonts w:cs="Arial"/>
+                <w:szCs w:val="18"/>
+              </w:rPr>
+            </w:pPr>
+            <w:r>
+              <w:rPr>
+                <w:rFonts w:cs="Arial"/>
+                <w:szCs w:val="18"/>
+              </w:rPr>
+              <w:t>18/09/2025</w:t>
+            </w:r>
+          </w:p>
+        </w:tc>
+        <w:tc>
+          <w:tcPr>
+            <w:tcW w:w="2500" w:type="dxa"/>
+          </w:tcPr>
+          <w:p>
+            <w:pPr>
+              <w:rPr>
+                <w:rFonts w:cs="Arial"/>
+                <w:szCs w:val="18"/>
+              </w:rPr>
+            </w:pPr>
+            <w:r>
+              <w:rPr>
+                <w:rFonts w:cs="Arial"/>
+                <w:szCs w:val="18"/>
+              </w:rPr>
+              <w:t>Philippe Gallen</w:t>
+            </w:r>
+          </w:p>
+        </w:tc>
+        <w:tc>
+          <w:tcPr>
+            <w:tcW w:w="4850" w:type="dxa"/>
+          </w:tcPr>
+          <w:p>
+            <w:pPr>
+              <w:ind w:firstLine="0"/>
+              <w:jc w:val="left"/>
+              <w:rPr>
+                <w:rFonts w:cs="Arial"/>
+                <w:szCs w:val="18"/>
+              </w:rPr>
+            </w:pPr>
+            <w:r>
+              <w:rPr>
+                <w:rFonts w:cs="Arial"/>
+                <w:szCs w:val="18"/>
+              </w:rPr>
+              <w:t>Modification de version</w:t>
             </w:r>
           </w:p>
         </w:tc>
@@ -2246,11 +2352,9 @@
         </w:rPr>
         <w:t>(IGN)</w:t>
       </w:r>
-      <w:proofErr w:type="spellStart"/>
       <w:r>
         <w:t>assistant_dfci</w:t>
       </w:r>
-      <w:proofErr w:type="spellEnd"/>
     </w:p>
     <w:p>
       <w:pPr>
@@ -3258,7 +3362,7 @@
             <w:tag w:val="_DCDateCreated"/>
             <w:id w:val="317545533"/>
             <w:dataBinding w:prefixMappings="xmlns:ns0='http://schemas.microsoft.com/office/2006/metadata/properties' xmlns:ns1='http://www.w3.org/2001/XMLSchema-instance' xmlns:ns2='http://schemas.microsoft.com/office/infopath/2007/PartnerControls' xmlns:ns3='a1322699-2fbb-4cce-8aba-176c4fa97253' xmlns:ns4='http://schemas.microsoft.com/sharepoint/v3' xmlns:ns5='http://schemas.microsoft.com/sharepoint/v3/fields' xmlns:ns6='f0ff482e-aa3b-417e-9d65-5f4cb2656651' " w:xpath="/ns0:properties[1]/documentManagement[1]/ns5:_DCDateCreated[1]" w:storeItemID="{1159403A-C237-488E-8C5E-DABF9FCE7043}"/>
-            <w:date w:fullDate="2025-07-24T00:00:00Z">
+            <w:date w:fullDate="2025-09-18T00:00:00Z">
               <w:dateFormat w:val="dd/MM/yyyy"/>
               <w:lid w:val="fr-FR"/>
               <w:storeMappedDataAs w:val="dateTime"/>
@@ -3292,7 +3396,17 @@
                   <w:sz w:val="16"/>
                   <w:szCs w:val="16"/>
                 </w:rPr>
-                <w:t>24/07/2025</w:t>
+                <w:t>18/09</w:t>
+              </w:r>
+              <w:r>
+                <w:rPr>
+                  <w:rFonts w:eastAsia="Calibri"/>
+                  <w:noProof/>
+                  <w:color w:val="002060"/>
+                  <w:sz w:val="16"/>
+                  <w:szCs w:val="16"/>
+                </w:rPr>
+                <w:t>/2025</w:t>
               </w:r>
             </w:p>
           </w:sdtContent>
@@ -6134,6 +6248,7 @@
     <w:rsid w:val="0054019A"/>
     <w:rsid w:val="00596E3A"/>
     <w:rsid w:val="00620954"/>
+    <w:rsid w:val="006830DA"/>
     <w:rsid w:val="006C217E"/>
     <w:rsid w:val="006C3956"/>
     <w:rsid w:val="006C48C9"/>
@@ -6924,29 +7039,6 @@
 </file>
 
 <file path=customXml/item1.xml><?xml version="1.0" encoding="utf-8"?>
-<b:Sources xmlns:b="http://schemas.openxmlformats.org/officeDocument/2006/bibliography" xmlns="http://schemas.openxmlformats.org/officeDocument/2006/bibliography" SelectedStyle="\APA.XSL" StyleName="APA"/>
-</file>
-
-<file path=customXml/item2.xml><?xml version="1.0" encoding="utf-8"?>
-<p:properties xmlns:p="http://schemas.microsoft.com/office/2006/metadata/properties" xmlns:xsi="http://www.w3.org/2001/XMLSchema-instance" xmlns:pc="http://schemas.microsoft.com/office/infopath/2007/PartnerControls">
-  <documentManagement>
-    <lcf76f155ced4ddcb4097134ff3c332f xmlns="b295003c-aa87-407e-9024-fdee4e88f6fa">
-      <Terms xmlns="http://schemas.microsoft.com/office/infopath/2007/PartnerControls"/>
-    </lcf76f155ced4ddcb4097134ff3c332f>
-  </documentManagement>
-</p:properties>
-</file>
-
-<file path=customXml/item3.xml><?xml version="1.0" encoding="utf-8"?>
-<?mso-contentType ?>
-<FormTemplates xmlns="http://schemas.microsoft.com/sharepoint/v3/contenttype/forms">
-  <Display>DocumentLibraryForm</Display>
-  <Edit>DocumentLibraryForm</Edit>
-  <New>DocumentLibraryForm</New>
-</FormTemplates>
-</file>
-
-<file path=customXml/item4.xml><?xml version="1.0" encoding="utf-8"?>
 <ct:contentTypeSchema xmlns:ct="http://schemas.microsoft.com/office/2006/metadata/contentType" xmlns:ma="http://schemas.microsoft.com/office/2006/metadata/properties/metaAttributes" ct:_="" ma:_="" ma:contentTypeName="Document" ma:contentTypeID="0x010100A3FA4CB5114F4B43B99F0B6DC8751D90" ma:contentTypeVersion="10" ma:contentTypeDescription="Crée un document." ma:contentTypeScope="" ma:versionID="501205be520febb413c56432ff8e6df1">
   <xsd:schema xmlns:xsd="http://www.w3.org/2001/XMLSchema" xmlns:xs="http://www.w3.org/2001/XMLSchema" xmlns:p="http://schemas.microsoft.com/office/2006/metadata/properties" xmlns:ns2="b295003c-aa87-407e-9024-fdee4e88f6fa" targetNamespace="http://schemas.microsoft.com/office/2006/metadata/properties" ma:root="true" ma:fieldsID="0378f5bf275aa5e8e5bb75b38d3da7db" ns2:_="">
     <xsd:import namespace="b295003c-aa87-407e-9024-fdee4e88f6fa"/>
@@ -7124,33 +7216,30 @@
 </ct:contentTypeSchema>
 </file>
 
-<file path=customXml/itemProps1.xml><?xml version="1.0" encoding="utf-8"?>
-<ds:datastoreItem xmlns:ds="http://schemas.openxmlformats.org/officeDocument/2006/customXml" ds:itemID="{0FF0F878-5F0F-460C-9013-40E72731A637}">
-  <ds:schemaRefs>
-    <ds:schemaRef ds:uri="http://schemas.openxmlformats.org/officeDocument/2006/bibliography"/>
-  </ds:schemaRefs>
-</ds:datastoreItem>
+<file path=customXml/item2.xml><?xml version="1.0" encoding="utf-8"?>
+<?mso-contentType ?>
+<FormTemplates xmlns="http://schemas.microsoft.com/sharepoint/v3/contenttype/forms">
+  <Display>DocumentLibraryForm</Display>
+  <Edit>DocumentLibraryForm</Edit>
+  <New>DocumentLibraryForm</New>
+</FormTemplates>
 </file>
 
-<file path=customXml/itemProps2.xml><?xml version="1.0" encoding="utf-8"?>
-<ds:datastoreItem xmlns:ds="http://schemas.openxmlformats.org/officeDocument/2006/customXml" ds:itemID="{1159403A-C237-488E-8C5E-DABF9FCE7043}">
-  <ds:schemaRefs>
-    <ds:schemaRef ds:uri="http://schemas.microsoft.com/office/2006/metadata/properties"/>
-    <ds:schemaRef ds:uri="http://schemas.microsoft.com/office/infopath/2007/PartnerControls"/>
-    <ds:schemaRef ds:uri="b295003c-aa87-407e-9024-fdee4e88f6fa"/>
-  </ds:schemaRefs>
-</ds:datastoreItem>
+<file path=customXml/item3.xml><?xml version="1.0" encoding="utf-8"?>
+<p:properties xmlns:p="http://schemas.microsoft.com/office/2006/metadata/properties" xmlns:xsi="http://www.w3.org/2001/XMLSchema-instance" xmlns:pc="http://schemas.microsoft.com/office/infopath/2007/PartnerControls">
+  <documentManagement>
+    <lcf76f155ced4ddcb4097134ff3c332f xmlns="b295003c-aa87-407e-9024-fdee4e88f6fa">
+      <Terms xmlns="http://schemas.microsoft.com/office/infopath/2007/PartnerControls"/>
+    </lcf76f155ced4ddcb4097134ff3c332f>
+  </documentManagement>
+</p:properties>
 </file>
 
-<file path=customXml/itemProps3.xml><?xml version="1.0" encoding="utf-8"?>
-<ds:datastoreItem xmlns:ds="http://schemas.openxmlformats.org/officeDocument/2006/customXml" ds:itemID="{EEE2973D-7DD7-4773-855D-5CAD81242BDE}">
-  <ds:schemaRefs>
-    <ds:schemaRef ds:uri="http://schemas.microsoft.com/sharepoint/v3/contenttype/forms"/>
-  </ds:schemaRefs>
-</ds:datastoreItem>
+<file path=customXml/item4.xml><?xml version="1.0" encoding="utf-8"?>
+<b:Sources xmlns:b="http://schemas.openxmlformats.org/officeDocument/2006/bibliography" xmlns="http://schemas.openxmlformats.org/officeDocument/2006/bibliography" SelectedStyle="\APA.XSL" StyleName="APA"/>
 </file>
 
-<file path=customXml/itemProps4.xml><?xml version="1.0" encoding="utf-8"?>
+<file path=customXml/itemProps1.xml><?xml version="1.0" encoding="utf-8"?>
 <ds:datastoreItem xmlns:ds="http://schemas.openxmlformats.org/officeDocument/2006/customXml" ds:itemID="{0B65258C-9CEC-414A-989C-54F659AC270E}">
   <ds:schemaRefs>
     <ds:schemaRef ds:uri="http://schemas.microsoft.com/office/2006/metadata/contentType"/>
@@ -7166,4 +7255,30 @@
     <ds:schemaRef ds:uri="http://schemas.microsoft.com/internal/obd"/>
   </ds:schemaRefs>
 </ds:datastoreItem>
+</file>
+
+<file path=customXml/itemProps2.xml><?xml version="1.0" encoding="utf-8"?>
+<ds:datastoreItem xmlns:ds="http://schemas.openxmlformats.org/officeDocument/2006/customXml" ds:itemID="{EEE2973D-7DD7-4773-855D-5CAD81242BDE}">
+  <ds:schemaRefs>
+    <ds:schemaRef ds:uri="http://schemas.microsoft.com/sharepoint/v3/contenttype/forms"/>
+  </ds:schemaRefs>
+</ds:datastoreItem>
+</file>
+
+<file path=customXml/itemProps3.xml><?xml version="1.0" encoding="utf-8"?>
+<ds:datastoreItem xmlns:ds="http://schemas.openxmlformats.org/officeDocument/2006/customXml" ds:itemID="{1159403A-C237-488E-8C5E-DABF9FCE7043}">
+  <ds:schemaRefs>
+    <ds:schemaRef ds:uri="http://schemas.microsoft.com/office/2006/metadata/properties"/>
+    <ds:schemaRef ds:uri="http://schemas.microsoft.com/office/infopath/2007/PartnerControls"/>
+    <ds:schemaRef ds:uri="b295003c-aa87-407e-9024-fdee4e88f6fa"/>
+  </ds:schemaRefs>
+</ds:datastoreItem>
+</file>
+
+<file path=customXml/itemProps4.xml><?xml version="1.0" encoding="utf-8"?>
+<ds:datastoreItem xmlns:ds="http://schemas.openxmlformats.org/officeDocument/2006/customXml" ds:itemID="{0FF0F878-5F0F-460C-9013-40E72731A637}">
+  <ds:schemaRefs>
+    <ds:schemaRef ds:uri="http://schemas.openxmlformats.org/officeDocument/2006/bibliography"/>
+  </ds:schemaRefs>
+</ds:datastoreItem>
 </file>
</xml_diff>

<commit_message>
possibilité de renommer un onglet + diverses ameliorations
</commit_message>
<xml_diff>
--- a/plugin_maitre.docx
+++ b/plugin_maitre.docx
@@ -115,7 +115,7 @@
                 <w:sz w:val="44"/>
                 <w:szCs w:val="44"/>
               </w:rPr>
-              <w:t>Plugin Maitre v1.0.</w:t>
+              <w:t>Plugin Maitre v1.</w:t>
             </w:r>
             <w:r>
               <w:rPr>
@@ -126,6 +126,26 @@
                 <w:szCs w:val="44"/>
               </w:rPr>
               <w:t>1</w:t>
+            </w:r>
+            <w:r>
+              <w:rPr>
+                <w:rFonts w:ascii="Times New Roman" w:hAnsi="Times New Roman" w:cs="Times New Roman"/>
+                <w:b/>
+                <w:noProof/>
+                <w:sz w:val="44"/>
+                <w:szCs w:val="44"/>
+              </w:rPr>
+              <w:t>.</w:t>
+            </w:r>
+            <w:r>
+              <w:rPr>
+                <w:rFonts w:ascii="Times New Roman" w:hAnsi="Times New Roman" w:cs="Times New Roman"/>
+                <w:b/>
+                <w:noProof/>
+                <w:sz w:val="44"/>
+                <w:szCs w:val="44"/>
+              </w:rPr>
+              <w:t>0</w:t>
             </w:r>
           </w:p>
         </w:tc>
@@ -374,7 +394,7 @@
                     <w:b/>
                     <w:szCs w:val="18"/>
                   </w:rPr>
-                  <w:t>1.0.</w:t>
+                  <w:t>1.</w:t>
                 </w:r>
                 <w:r>
                   <w:rPr>
@@ -382,7 +402,7 @@
                     <w:b/>
                     <w:szCs w:val="18"/>
                   </w:rPr>
-                  <w:t>1</w:t>
+                  <w:t>1.0</w:t>
                 </w:r>
               </w:sdtContent>
             </w:sdt>
@@ -409,7 +429,35 @@
                 <w:rFonts w:cs="Arial"/>
                 <w:szCs w:val="18"/>
               </w:rPr>
-              <w:t>24/07/2025</w:t>
+              <w:t>15</w:t>
+            </w:r>
+            <w:r>
+              <w:rPr>
+                <w:rFonts w:cs="Arial"/>
+                <w:szCs w:val="18"/>
+              </w:rPr>
+              <w:t>/</w:t>
+            </w:r>
+            <w:r>
+              <w:rPr>
+                <w:rFonts w:cs="Arial"/>
+                <w:szCs w:val="18"/>
+              </w:rPr>
+              <w:t>01</w:t>
+            </w:r>
+            <w:r>
+              <w:rPr>
+                <w:rFonts w:cs="Arial"/>
+                <w:szCs w:val="18"/>
+              </w:rPr>
+              <w:t>/</w:t>
+            </w:r>
+            <w:r>
+              <w:rPr>
+                <w:rFonts w:cs="Arial"/>
+                <w:szCs w:val="18"/>
+              </w:rPr>
+              <w:t>2026</w:t>
             </w:r>
           </w:p>
         </w:tc>
@@ -803,7 +851,35 @@
                 <w:rFonts w:cs="Arial"/>
                 <w:szCs w:val="18"/>
               </w:rPr>
-              <w:t>24/07/2025</w:t>
+              <w:t>15</w:t>
+            </w:r>
+            <w:r>
+              <w:rPr>
+                <w:rFonts w:cs="Arial"/>
+                <w:szCs w:val="18"/>
+              </w:rPr>
+              <w:t>/</w:t>
+            </w:r>
+            <w:r>
+              <w:rPr>
+                <w:rFonts w:cs="Arial"/>
+                <w:szCs w:val="18"/>
+              </w:rPr>
+              <w:t>01</w:t>
+            </w:r>
+            <w:r>
+              <w:rPr>
+                <w:rFonts w:cs="Arial"/>
+                <w:szCs w:val="18"/>
+              </w:rPr>
+              <w:t>/</w:t>
+            </w:r>
+            <w:r>
+              <w:rPr>
+                <w:rFonts w:cs="Arial"/>
+                <w:szCs w:val="18"/>
+              </w:rPr>
+              <w:t>2026</w:t>
             </w:r>
           </w:p>
         </w:tc>
@@ -1027,42 +1103,35 @@
                 <w:rFonts w:cs="Arial"/>
                 <w:szCs w:val="18"/>
               </w:rPr>
-              <w:t>2</w:t>
+              <w:t>15</w:t>
             </w:r>
             <w:r>
               <w:rPr>
                 <w:rFonts w:cs="Arial"/>
                 <w:szCs w:val="18"/>
               </w:rPr>
-              <w:t>4</w:t>
+              <w:t>/</w:t>
             </w:r>
             <w:r>
               <w:rPr>
                 <w:rFonts w:cs="Arial"/>
                 <w:szCs w:val="18"/>
               </w:rPr>
-              <w:t>/0</w:t>
+              <w:t>01</w:t>
             </w:r>
             <w:r>
               <w:rPr>
                 <w:rFonts w:cs="Arial"/>
                 <w:szCs w:val="18"/>
               </w:rPr>
-              <w:t>7</w:t>
+              <w:t>/</w:t>
             </w:r>
             <w:r>
               <w:rPr>
                 <w:rFonts w:cs="Arial"/>
                 <w:szCs w:val="18"/>
               </w:rPr>
-              <w:t>/202</w:t>
-            </w:r>
-            <w:r>
-              <w:rPr>
-                <w:rFonts w:cs="Arial"/>
-                <w:szCs w:val="18"/>
-              </w:rPr>
-              <w:t>5</w:t>
+              <w:t>2026</w:t>
             </w:r>
           </w:p>
         </w:tc>
@@ -1111,94 +1180,6 @@
                 <w:szCs w:val="18"/>
               </w:rPr>
               <w:t xml:space="preserve">Création </w:t>
-            </w:r>
-          </w:p>
-        </w:tc>
-      </w:tr>
-      <w:tr>
-        <w:tc>
-          <w:tcPr>
-            <w:tcW w:w="1122" w:type="dxa"/>
-          </w:tcPr>
-          <w:p>
-            <w:pPr>
-              <w:ind w:firstLine="34"/>
-              <w:jc w:val="center"/>
-              <w:rPr>
-                <w:rFonts w:cs="Arial"/>
-                <w:szCs w:val="18"/>
-              </w:rPr>
-            </w:pPr>
-            <w:r>
-              <w:rPr>
-                <w:rFonts w:cs="Arial"/>
-                <w:szCs w:val="18"/>
-              </w:rPr>
-              <w:t>1.0.1</w:t>
-            </w:r>
-          </w:p>
-        </w:tc>
-        <w:tc>
-          <w:tcPr>
-            <w:tcW w:w="1400" w:type="dxa"/>
-          </w:tcPr>
-          <w:p>
-            <w:pPr>
-              <w:ind w:firstLine="0"/>
-              <w:jc w:val="center"/>
-              <w:rPr>
-                <w:rFonts w:cs="Arial"/>
-                <w:szCs w:val="18"/>
-              </w:rPr>
-            </w:pPr>
-            <w:r>
-              <w:rPr>
-                <w:rFonts w:cs="Arial"/>
-                <w:szCs w:val="18"/>
-              </w:rPr>
-              <w:t>18/09/2025</w:t>
-            </w:r>
-          </w:p>
-        </w:tc>
-        <w:tc>
-          <w:tcPr>
-            <w:tcW w:w="2500" w:type="dxa"/>
-          </w:tcPr>
-          <w:p>
-            <w:pPr>
-              <w:rPr>
-                <w:rFonts w:cs="Arial"/>
-                <w:szCs w:val="18"/>
-              </w:rPr>
-            </w:pPr>
-            <w:r>
-              <w:rPr>
-                <w:rFonts w:cs="Arial"/>
-                <w:szCs w:val="18"/>
-              </w:rPr>
-              <w:t>Philippe Gallen</w:t>
-            </w:r>
-          </w:p>
-        </w:tc>
-        <w:tc>
-          <w:tcPr>
-            <w:tcW w:w="4850" w:type="dxa"/>
-          </w:tcPr>
-          <w:p>
-            <w:pPr>
-              <w:ind w:firstLine="0"/>
-              <w:jc w:val="left"/>
-              <w:rPr>
-                <w:rFonts w:cs="Arial"/>
-                <w:szCs w:val="18"/>
-              </w:rPr>
-            </w:pPr>
-            <w:r>
-              <w:rPr>
-                <w:rFonts w:cs="Arial"/>
-                <w:szCs w:val="18"/>
-              </w:rPr>
-              <w:t>Modification de version</w:t>
             </w:r>
           </w:p>
         </w:tc>
@@ -1269,7 +1250,7 @@
           <w:r>
             <w:fldChar w:fldCharType="separate"/>
           </w:r>
-          <w:hyperlink w:anchor="_Toc204255493" w:history="1">
+          <w:hyperlink w:anchor="_Toc219407366" w:history="1">
             <w:r>
               <w:rPr>
                 <w:rStyle w:val="Lienhypertexte"/>
@@ -1307,7 +1288,7 @@
               <w:rPr>
                 <w:webHidden/>
               </w:rPr>
-              <w:instrText xml:space="preserve"> PAGEREF _Toc204255493 \h </w:instrText>
+              <w:instrText xml:space="preserve"> PAGEREF _Toc219407366 \h </w:instrText>
             </w:r>
             <w:r>
               <w:rPr>
@@ -1344,7 +1325,7 @@
               <w:szCs w:val="22"/>
             </w:rPr>
           </w:pPr>
-          <w:hyperlink w:anchor="_Toc204255494" w:history="1">
+          <w:hyperlink w:anchor="_Toc219407367" w:history="1">
             <w:r>
               <w:rPr>
                 <w:rStyle w:val="Lienhypertexte"/>
@@ -1382,7 +1363,7 @@
               <w:rPr>
                 <w:webHidden/>
               </w:rPr>
-              <w:instrText xml:space="preserve"> PAGEREF _Toc204255494 \h </w:instrText>
+              <w:instrText xml:space="preserve"> PAGEREF _Toc219407367 \h </w:instrText>
             </w:r>
             <w:r>
               <w:rPr>
@@ -1419,7 +1400,7 @@
               <w:szCs w:val="22"/>
             </w:rPr>
           </w:pPr>
-          <w:hyperlink w:anchor="_Toc204255495" w:history="1">
+          <w:hyperlink w:anchor="_Toc219407368" w:history="1">
             <w:r>
               <w:rPr>
                 <w:rStyle w:val="Lienhypertexte"/>
@@ -1457,7 +1438,7 @@
               <w:rPr>
                 <w:webHidden/>
               </w:rPr>
-              <w:instrText xml:space="preserve"> PAGEREF _Toc204255495 \h </w:instrText>
+              <w:instrText xml:space="preserve"> PAGEREF _Toc219407368 \h </w:instrText>
             </w:r>
             <w:r>
               <w:rPr>
@@ -1494,7 +1475,7 @@
               <w:szCs w:val="22"/>
             </w:rPr>
           </w:pPr>
-          <w:hyperlink w:anchor="_Toc204255496" w:history="1">
+          <w:hyperlink w:anchor="_Toc219407369" w:history="1">
             <w:r>
               <w:rPr>
                 <w:rStyle w:val="Lienhypertexte"/>
@@ -1532,7 +1513,7 @@
               <w:rPr>
                 <w:webHidden/>
               </w:rPr>
-              <w:instrText xml:space="preserve"> PAGEREF _Toc204255496 \h </w:instrText>
+              <w:instrText xml:space="preserve"> PAGEREF _Toc219407369 \h </w:instrText>
             </w:r>
             <w:r>
               <w:rPr>
@@ -1569,7 +1550,7 @@
               <w:szCs w:val="22"/>
             </w:rPr>
           </w:pPr>
-          <w:hyperlink w:anchor="_Toc204255497" w:history="1">
+          <w:hyperlink w:anchor="_Toc219407370" w:history="1">
             <w:r>
               <w:rPr>
                 <w:rStyle w:val="Lienhypertexte"/>
@@ -1607,7 +1588,7 @@
               <w:rPr>
                 <w:webHidden/>
               </w:rPr>
-              <w:instrText xml:space="preserve"> PAGEREF _Toc204255497 \h </w:instrText>
+              <w:instrText xml:space="preserve"> PAGEREF _Toc219407370 \h </w:instrText>
             </w:r>
             <w:r>
               <w:rPr>
@@ -1643,7 +1624,7 @@
               <w:szCs w:val="22"/>
             </w:rPr>
           </w:pPr>
-          <w:hyperlink w:anchor="_Toc204255498" w:history="1">
+          <w:hyperlink w:anchor="_Toc219407371" w:history="1">
             <w:r>
               <w:rPr>
                 <w:rStyle w:val="Lienhypertexte"/>
@@ -1680,7 +1661,7 @@
               <w:rPr>
                 <w:webHidden/>
               </w:rPr>
-              <w:instrText xml:space="preserve"> PAGEREF _Toc204255498 \h </w:instrText>
+              <w:instrText xml:space="preserve"> PAGEREF _Toc219407371 \h </w:instrText>
             </w:r>
             <w:r>
               <w:rPr>
@@ -1716,7 +1697,7 @@
               <w:szCs w:val="22"/>
             </w:rPr>
           </w:pPr>
-          <w:hyperlink w:anchor="_Toc204255499" w:history="1">
+          <w:hyperlink w:anchor="_Toc219407372" w:history="1">
             <w:r>
               <w:rPr>
                 <w:rStyle w:val="Lienhypertexte"/>
@@ -1753,7 +1734,7 @@
               <w:rPr>
                 <w:webHidden/>
               </w:rPr>
-              <w:instrText xml:space="preserve"> PAGEREF _Toc204255499 \h </w:instrText>
+              <w:instrText xml:space="preserve"> PAGEREF _Toc219407372 \h </w:instrText>
             </w:r>
             <w:r>
               <w:rPr>
@@ -1789,7 +1770,7 @@
               <w:szCs w:val="22"/>
             </w:rPr>
           </w:pPr>
-          <w:hyperlink w:anchor="_Toc204255500" w:history="1">
+          <w:hyperlink w:anchor="_Toc219407373" w:history="1">
             <w:r>
               <w:rPr>
                 <w:rStyle w:val="Lienhypertexte"/>
@@ -1826,7 +1807,80 @@
               <w:rPr>
                 <w:webHidden/>
               </w:rPr>
-              <w:instrText xml:space="preserve"> PAGEREF _Toc204255500 \h </w:instrText>
+              <w:instrText xml:space="preserve"> PAGEREF _Toc219407373 \h </w:instrText>
+            </w:r>
+            <w:r>
+              <w:rPr>
+                <w:webHidden/>
+              </w:rPr>
+            </w:r>
+            <w:r>
+              <w:rPr>
+                <w:webHidden/>
+              </w:rPr>
+              <w:fldChar w:fldCharType="separate"/>
+            </w:r>
+            <w:r>
+              <w:rPr>
+                <w:webHidden/>
+              </w:rPr>
+              <w:t>4</w:t>
+            </w:r>
+            <w:r>
+              <w:rPr>
+                <w:webHidden/>
+              </w:rPr>
+              <w:fldChar w:fldCharType="end"/>
+            </w:r>
+          </w:hyperlink>
+        </w:p>
+        <w:p>
+          <w:pPr>
+            <w:pStyle w:val="TM2"/>
+            <w:rPr>
+              <w:rFonts w:asciiTheme="minorHAnsi" w:eastAsiaTheme="minorEastAsia" w:hAnsiTheme="minorHAnsi" w:cstheme="minorBidi"/>
+              <w:sz w:val="22"/>
+              <w:szCs w:val="22"/>
+            </w:rPr>
+          </w:pPr>
+          <w:hyperlink w:anchor="_Toc219407374" w:history="1">
+            <w:r>
+              <w:rPr>
+                <w:rStyle w:val="Lienhypertexte"/>
+              </w:rPr>
+              <w:t>5.4</w:t>
+            </w:r>
+            <w:r>
+              <w:rPr>
+                <w:rFonts w:asciiTheme="minorHAnsi" w:eastAsiaTheme="minorEastAsia" w:hAnsiTheme="minorHAnsi" w:cstheme="minorBidi"/>
+                <w:sz w:val="22"/>
+                <w:szCs w:val="22"/>
+              </w:rPr>
+              <w:tab/>
+            </w:r>
+            <w:r>
+              <w:rPr>
+                <w:rStyle w:val="Lienhypertexte"/>
+              </w:rPr>
+              <w:t>Renommer une barre d’outils</w:t>
+            </w:r>
+            <w:r>
+              <w:rPr>
+                <w:webHidden/>
+              </w:rPr>
+              <w:tab/>
+            </w:r>
+            <w:r>
+              <w:rPr>
+                <w:webHidden/>
+              </w:rPr>
+              <w:fldChar w:fldCharType="begin"/>
+            </w:r>
+            <w:r>
+              <w:rPr>
+                <w:webHidden/>
+              </w:rPr>
+              <w:instrText xml:space="preserve"> PAGEREF _Toc219407374 \h </w:instrText>
             </w:r>
             <w:r>
               <w:rPr>
@@ -1863,7 +1917,7 @@
               <w:szCs w:val="22"/>
             </w:rPr>
           </w:pPr>
-          <w:hyperlink w:anchor="_Toc204255501" w:history="1">
+          <w:hyperlink w:anchor="_Toc219407375" w:history="1">
             <w:r>
               <w:rPr>
                 <w:rStyle w:val="Lienhypertexte"/>
@@ -1901,7 +1955,7 @@
               <w:rPr>
                 <w:webHidden/>
               </w:rPr>
-              <w:instrText xml:space="preserve"> PAGEREF _Toc204255501 \h </w:instrText>
+              <w:instrText xml:space="preserve"> PAGEREF _Toc219407375 \h </w:instrText>
             </w:r>
             <w:r>
               <w:rPr>
@@ -1918,7 +1972,7 @@
               <w:rPr>
                 <w:webHidden/>
               </w:rPr>
-              <w:t>4</w:t>
+              <w:t>5</w:t>
             </w:r>
             <w:r>
               <w:rPr>
@@ -1937,7 +1991,7 @@
               <w:szCs w:val="22"/>
             </w:rPr>
           </w:pPr>
-          <w:hyperlink w:anchor="_Toc204255502" w:history="1">
+          <w:hyperlink w:anchor="_Toc219407376" w:history="1">
             <w:r>
               <w:rPr>
                 <w:rStyle w:val="Lienhypertexte"/>
@@ -1974,7 +2028,7 @@
               <w:rPr>
                 <w:webHidden/>
               </w:rPr>
-              <w:instrText xml:space="preserve"> PAGEREF _Toc204255502 \h </w:instrText>
+              <w:instrText xml:space="preserve"> PAGEREF _Toc219407376 \h </w:instrText>
             </w:r>
             <w:r>
               <w:rPr>
@@ -1991,7 +2045,7 @@
               <w:rPr>
                 <w:webHidden/>
               </w:rPr>
-              <w:t>4</w:t>
+              <w:t>5</w:t>
             </w:r>
             <w:r>
               <w:rPr>
@@ -2010,7 +2064,7 @@
               <w:szCs w:val="22"/>
             </w:rPr>
           </w:pPr>
-          <w:hyperlink w:anchor="_Toc204255503" w:history="1">
+          <w:hyperlink w:anchor="_Toc219407377" w:history="1">
             <w:r>
               <w:rPr>
                 <w:rStyle w:val="Lienhypertexte"/>
@@ -2047,7 +2101,7 @@
               <w:rPr>
                 <w:webHidden/>
               </w:rPr>
-              <w:instrText xml:space="preserve"> PAGEREF _Toc204255503 \h </w:instrText>
+              <w:instrText xml:space="preserve"> PAGEREF _Toc219407377 \h </w:instrText>
             </w:r>
             <w:r>
               <w:rPr>
@@ -2107,7 +2161,7 @@
       <w:pPr>
         <w:pStyle w:val="Titre1"/>
       </w:pPr>
-      <w:bookmarkStart w:id="0" w:name="_Toc204255493"/>
+      <w:bookmarkStart w:id="0" w:name="_Toc219407366"/>
       <w:r>
         <w:lastRenderedPageBreak/>
         <w:t>Prérequis</w:t>
@@ -2127,7 +2181,7 @@
       <w:pPr>
         <w:pStyle w:val="Titre1"/>
       </w:pPr>
-      <w:bookmarkStart w:id="1" w:name="_Toc204255494"/>
+      <w:bookmarkStart w:id="1" w:name="_Toc219407367"/>
       <w:r>
         <w:t>Résumé</w:t>
       </w:r>
@@ -2150,7 +2204,7 @@
       <w:pPr>
         <w:pStyle w:val="Titre1"/>
       </w:pPr>
-      <w:bookmarkStart w:id="2" w:name="_Toc204255495"/>
+      <w:bookmarkStart w:id="2" w:name="_Toc219407368"/>
       <w:r>
         <w:t>Installation</w:t>
       </w:r>
@@ -2248,7 +2302,7 @@
       <w:pPr>
         <w:pStyle w:val="Titre1"/>
       </w:pPr>
-      <w:bookmarkStart w:id="3" w:name="_Toc204255496"/>
+      <w:bookmarkStart w:id="3" w:name="_Toc219407369"/>
       <w:r>
         <w:t>Présentation</w:t>
       </w:r>
@@ -2286,10 +2340,10 @@
           <w:noProof/>
         </w:rPr>
         <w:drawing>
-          <wp:inline distT="0" distB="0" distL="0" distR="0" wp14:anchorId="33917C3C" wp14:editId="1CEEB627">
-            <wp:extent cx="3566160" cy="2926809"/>
-            <wp:effectExtent l="0" t="0" r="0" b="6985"/>
-            <wp:docPr id="14" name="Image 14"/>
+          <wp:inline distT="0" distB="0" distL="0" distR="0" wp14:anchorId="5738A27C" wp14:editId="3B2411F9">
+            <wp:extent cx="3673503" cy="2970999"/>
+            <wp:effectExtent l="0" t="0" r="3175" b="1270"/>
+            <wp:docPr id="1" name="Image 1" descr="Une image contenant texte, Appareils électroniques, capture d’écran, affichage&#10;&#10;Description générée automatiquement"/>
             <wp:cNvGraphicFramePr>
               <a:graphicFrameLocks xmlns:a="http://schemas.openxmlformats.org/drawingml/2006/main" noChangeAspect="1"/>
             </wp:cNvGraphicFramePr>
@@ -2297,7 +2351,7 @@
               <a:graphicData uri="http://schemas.openxmlformats.org/drawingml/2006/picture">
                 <pic:pic xmlns:pic="http://schemas.openxmlformats.org/drawingml/2006/picture">
                   <pic:nvPicPr>
-                    <pic:cNvPr id="14" name="Image 14"/>
+                    <pic:cNvPr id="1" name="Image 1" descr="Une image contenant texte, Appareils électroniques, capture d’écran, affichage&#10;&#10;Description générée automatiquement"/>
                     <pic:cNvPicPr/>
                   </pic:nvPicPr>
                   <pic:blipFill>
@@ -2315,7 +2369,7 @@
                   <pic:spPr>
                     <a:xfrm>
                       <a:off x="0" y="0"/>
-                      <a:ext cx="3571064" cy="2930834"/>
+                      <a:ext cx="3679022" cy="2975463"/>
                     </a:xfrm>
                     <a:prstGeom prst="rect">
                       <a:avLst/>
@@ -2336,10 +2390,19 @@
     <w:p/>
     <w:p>
       <w:r>
-        <w:t>Les plugins IGN sont détectés automatiquement</w:t>
-      </w:r>
-      <w:r>
-        <w:t xml:space="preserve"> si les répertoires sont préfixés par « (IGN) ».</w:t>
+        <w:t>Tous l</w:t>
+      </w:r>
+      <w:r>
+        <w:t>es plugins IGN sont détectés automatiquement</w:t>
+      </w:r>
+      <w:r>
+        <w:t xml:space="preserve"> si les répertoires</w:t>
+      </w:r>
+      <w:r>
+        <w:t xml:space="preserve"> des plugins</w:t>
+      </w:r>
+      <w:r>
+        <w:t xml:space="preserve"> sont préfixés par « (IGN) ».</w:t>
       </w:r>
     </w:p>
     <w:p>
@@ -2352,15 +2415,17 @@
         </w:rPr>
         <w:t>(IGN)</w:t>
       </w:r>
+      <w:proofErr w:type="spellStart"/>
       <w:r>
         <w:t>assistant_dfci</w:t>
       </w:r>
+      <w:proofErr w:type="spellEnd"/>
     </w:p>
     <w:p>
       <w:pPr>
         <w:pStyle w:val="Titre1"/>
       </w:pPr>
-      <w:bookmarkStart w:id="4" w:name="_Toc204255497"/>
+      <w:bookmarkStart w:id="4" w:name="_Toc219407370"/>
       <w:r>
         <w:lastRenderedPageBreak/>
         <w:t>Utilisatio</w:t>
@@ -2375,7 +2440,7 @@
       <w:pPr>
         <w:pStyle w:val="Titre2"/>
       </w:pPr>
-      <w:bookmarkStart w:id="5" w:name="_Toc204255498"/>
+      <w:bookmarkStart w:id="5" w:name="_Toc219407371"/>
       <w:r>
         <w:t>Ajout des plugins dans le menu IGN</w:t>
       </w:r>
@@ -2387,7 +2452,10 @@
         <w:ind w:left="576"/>
       </w:pPr>
       <w:r>
-        <w:t>Pour intégrer des plugins dans le menu il suffit de les sélectionner</w:t>
+        <w:t xml:space="preserve">Pour intégrer des plugins dans le menu il suffit de les </w:t>
+      </w:r>
+      <w:r>
+        <w:t>« cocher » dans l’interface sous l’onglet « menu IGN »</w:t>
       </w:r>
     </w:p>
     <w:p>
@@ -2461,7 +2529,7 @@
       <w:pPr>
         <w:pStyle w:val="Titre2"/>
       </w:pPr>
-      <w:bookmarkStart w:id="6" w:name="_Toc204255499"/>
+      <w:bookmarkStart w:id="6" w:name="_Toc219407372"/>
       <w:r>
         <w:t>Créer une barre d’outils et ajout des plugins</w:t>
       </w:r>
@@ -2491,10 +2559,10 @@
           <w:noProof/>
         </w:rPr>
         <w:drawing>
-          <wp:inline distT="0" distB="0" distL="0" distR="0" wp14:anchorId="6CA0DA16" wp14:editId="563924A2">
-            <wp:extent cx="2636520" cy="762000"/>
-            <wp:effectExtent l="0" t="0" r="0" b="0"/>
-            <wp:docPr id="25" name="Image 25"/>
+          <wp:inline distT="0" distB="0" distL="0" distR="0" wp14:anchorId="35EF9949" wp14:editId="7C2A1F5B">
+            <wp:extent cx="1882303" cy="762066"/>
+            <wp:effectExtent l="0" t="0" r="3810" b="0"/>
+            <wp:docPr id="4" name="Image 4" descr="Une image contenant texte, capture d’écran, Police, ligne&#10;&#10;Description générée automatiquement"/>
             <wp:cNvGraphicFramePr>
               <a:graphicFrameLocks xmlns:a="http://schemas.openxmlformats.org/drawingml/2006/main" noChangeAspect="1"/>
             </wp:cNvGraphicFramePr>
@@ -2502,10 +2570,8 @@
               <a:graphicData uri="http://schemas.openxmlformats.org/drawingml/2006/picture">
                 <pic:pic xmlns:pic="http://schemas.openxmlformats.org/drawingml/2006/picture">
                   <pic:nvPicPr>
-                    <pic:cNvPr id="0" name="Picture 1"/>
-                    <pic:cNvPicPr>
-                      <a:picLocks noChangeAspect="1" noChangeArrowheads="1"/>
-                    </pic:cNvPicPr>
+                    <pic:cNvPr id="4" name="Image 4" descr="Une image contenant texte, capture d’écran, Police, ligne&#10;&#10;Description générée automatiquement"/>
+                    <pic:cNvPicPr/>
                   </pic:nvPicPr>
                   <pic:blipFill>
                     <a:blip r:embed="rId15">
@@ -2515,23 +2581,18 @@
                         </a:ext>
                       </a:extLst>
                     </a:blip>
-                    <a:srcRect/>
                     <a:stretch>
                       <a:fillRect/>
                     </a:stretch>
                   </pic:blipFill>
-                  <pic:spPr bwMode="auto">
+                  <pic:spPr>
                     <a:xfrm>
                       <a:off x="0" y="0"/>
-                      <a:ext cx="2636520" cy="762000"/>
+                      <a:ext cx="1882303" cy="762066"/>
                     </a:xfrm>
                     <a:prstGeom prst="rect">
                       <a:avLst/>
                     </a:prstGeom>
-                    <a:noFill/>
-                    <a:ln>
-                      <a:noFill/>
-                    </a:ln>
                   </pic:spPr>
                 </pic:pic>
               </a:graphicData>
@@ -2550,8 +2611,19 @@
         <w:ind w:firstLine="432"/>
       </w:pPr>
       <w:r>
-        <w:t>Renseigner un nom et cliquez sur « ajouter une barre d’outils »</w:t>
-      </w:r>
+        <w:t>Renseigner un nom et cliquez sur</w:t>
+      </w:r>
+      <w:r>
+        <w:t xml:space="preserve"> « </w:t>
+      </w:r>
+      <w:proofErr w:type="gramStart"/>
+      <w:r>
+        <w:t>Ajouter</w:t>
+      </w:r>
+      <w:r>
+        <w:t>»</w:t>
+      </w:r>
+      <w:proofErr w:type="gramEnd"/>
     </w:p>
     <w:p>
       <w:pPr>
@@ -2563,7 +2635,16 @@
         <w:ind w:firstLine="432"/>
       </w:pPr>
       <w:r>
-        <w:t>Ci-dessous, 2 barres d’outils ont étés créées.</w:t>
+        <w:t xml:space="preserve">Ci-dessous, </w:t>
+      </w:r>
+      <w:r>
+        <w:t>3</w:t>
+      </w:r>
+      <w:r>
+        <w:t xml:space="preserve"> barres d’outils ont été créées</w:t>
+      </w:r>
+      <w:r>
+        <w:t>.</w:t>
       </w:r>
     </w:p>
     <w:p>
@@ -2581,10 +2662,10 @@
           <w:noProof/>
         </w:rPr>
         <w:drawing>
-          <wp:inline distT="0" distB="0" distL="0" distR="0" wp14:anchorId="73949D18" wp14:editId="721A3179">
-            <wp:extent cx="3825572" cy="3139712"/>
-            <wp:effectExtent l="0" t="0" r="3810" b="3810"/>
-            <wp:docPr id="26" name="Image 26"/>
+          <wp:inline distT="0" distB="0" distL="0" distR="0" wp14:anchorId="189A58B9" wp14:editId="40B88512">
+            <wp:extent cx="3825572" cy="3093988"/>
+            <wp:effectExtent l="0" t="0" r="3810" b="0"/>
+            <wp:docPr id="5" name="Image 5" descr="Une image contenant texte, Appareils électroniques, capture d’écran, affichage&#10;&#10;Description générée automatiquement"/>
             <wp:cNvGraphicFramePr>
               <a:graphicFrameLocks xmlns:a="http://schemas.openxmlformats.org/drawingml/2006/main" noChangeAspect="1"/>
             </wp:cNvGraphicFramePr>
@@ -2592,7 +2673,7 @@
               <a:graphicData uri="http://schemas.openxmlformats.org/drawingml/2006/picture">
                 <pic:pic xmlns:pic="http://schemas.openxmlformats.org/drawingml/2006/picture">
                   <pic:nvPicPr>
-                    <pic:cNvPr id="26" name="Image 26"/>
+                    <pic:cNvPr id="5" name="Image 5" descr="Une image contenant texte, Appareils électroniques, capture d’écran, affichage&#10;&#10;Description générée automatiquement"/>
                     <pic:cNvPicPr/>
                   </pic:nvPicPr>
                   <pic:blipFill>
@@ -2610,7 +2691,7 @@
                   <pic:spPr>
                     <a:xfrm>
                       <a:off x="0" y="0"/>
-                      <a:ext cx="3825572" cy="3139712"/>
+                      <a:ext cx="3825572" cy="3093988"/>
                     </a:xfrm>
                     <a:prstGeom prst="rect">
                       <a:avLst/>
@@ -2632,137 +2713,54 @@
       <w:pPr>
         <w:ind w:firstLine="432"/>
       </w:pPr>
+      <w:r>
+        <w:t>Les barres d’outils n’apparaitront</w:t>
+      </w:r>
+      <w:r>
+        <w:t xml:space="preserve"> dans QGIS</w:t>
+      </w:r>
+      <w:r>
+        <w:t xml:space="preserve"> qu’</w:t>
+      </w:r>
+      <w:r>
+        <w:t>après</w:t>
+      </w:r>
+      <w:r>
+        <w:t xml:space="preserve"> avoir « coché » des plugins pour </w:t>
+      </w:r>
+      <w:r>
+        <w:t xml:space="preserve">chaque </w:t>
+      </w:r>
+      <w:proofErr w:type="gramStart"/>
+      <w:r>
+        <w:t>barres</w:t>
+      </w:r>
+      <w:proofErr w:type="gramEnd"/>
+      <w:r>
+        <w:t xml:space="preserve"> puis d’actualiser </w:t>
+      </w:r>
     </w:p>
     <w:p>
       <w:pPr>
         <w:ind w:firstLine="432"/>
       </w:pPr>
     </w:p>
-    <w:p>
-      <w:pPr>
-        <w:ind w:firstLine="432"/>
-      </w:pPr>
-    </w:p>
-    <w:p>
-      <w:pPr>
-        <w:ind w:firstLine="432"/>
-      </w:pPr>
-    </w:p>
-    <w:p>
-      <w:pPr>
-        <w:ind w:firstLine="432"/>
-      </w:pPr>
-    </w:p>
-    <w:p>
-      <w:pPr>
-        <w:ind w:firstLine="432"/>
-      </w:pPr>
-    </w:p>
-    <w:p>
-      <w:pPr>
-        <w:ind w:firstLine="432"/>
-      </w:pPr>
-    </w:p>
-    <w:p>
-      <w:pPr>
-        <w:ind w:firstLine="432"/>
-      </w:pPr>
-    </w:p>
-    <w:p>
-      <w:pPr>
-        <w:ind w:firstLine="432"/>
-      </w:pPr>
-      <w:r>
-        <w:lastRenderedPageBreak/>
-        <w:t>Il ne reste plus qu’à ajouter les plugins désirés dans les barres d’outils correspondantes en les sélectionnant</w:t>
-      </w:r>
-      <w:r>
-        <w:t xml:space="preserve"> sans oublier de cliquer sur « Actualiser / Sauvegarder »</w:t>
-      </w:r>
-    </w:p>
+    <w:p/>
+    <w:p/>
     <w:p>
       <w:pPr>
         <w:pStyle w:val="Paragraphedeliste"/>
         <w:ind w:left="936"/>
       </w:pPr>
     </w:p>
-    <w:p>
-      <w:pPr>
-        <w:pStyle w:val="Paragraphedeliste"/>
-        <w:ind w:left="936"/>
-      </w:pPr>
-    </w:p>
-    <w:p>
-      <w:pPr>
-        <w:jc w:val="center"/>
-      </w:pPr>
-      <w:r>
-        <w:rPr>
-          <w:noProof/>
-        </w:rPr>
-        <w:drawing>
-          <wp:inline distT="0" distB="0" distL="0" distR="0" wp14:anchorId="6C8ACE49" wp14:editId="0E11665D">
-            <wp:extent cx="3825240" cy="3139440"/>
-            <wp:effectExtent l="0" t="0" r="3810" b="3810"/>
-            <wp:docPr id="27" name="Image 27"/>
-            <wp:cNvGraphicFramePr>
-              <a:graphicFrameLocks xmlns:a="http://schemas.openxmlformats.org/drawingml/2006/main" noChangeAspect="1"/>
-            </wp:cNvGraphicFramePr>
-            <a:graphic xmlns:a="http://schemas.openxmlformats.org/drawingml/2006/main">
-              <a:graphicData uri="http://schemas.openxmlformats.org/drawingml/2006/picture">
-                <pic:pic xmlns:pic="http://schemas.openxmlformats.org/drawingml/2006/picture">
-                  <pic:nvPicPr>
-                    <pic:cNvPr id="0" name="Picture 2"/>
-                    <pic:cNvPicPr>
-                      <a:picLocks noChangeAspect="1" noChangeArrowheads="1"/>
-                    </pic:cNvPicPr>
-                  </pic:nvPicPr>
-                  <pic:blipFill>
-                    <a:blip r:embed="rId17">
-                      <a:extLst>
-                        <a:ext uri="{28A0092B-C50C-407E-A947-70E740481C1C}">
-                          <a14:useLocalDpi xmlns:a14="http://schemas.microsoft.com/office/drawing/2010/main" val="0"/>
-                        </a:ext>
-                      </a:extLst>
-                    </a:blip>
-                    <a:srcRect/>
-                    <a:stretch>
-                      <a:fillRect/>
-                    </a:stretch>
-                  </pic:blipFill>
-                  <pic:spPr bwMode="auto">
-                    <a:xfrm>
-                      <a:off x="0" y="0"/>
-                      <a:ext cx="3825240" cy="3139440"/>
-                    </a:xfrm>
-                    <a:prstGeom prst="rect">
-                      <a:avLst/>
-                    </a:prstGeom>
-                    <a:noFill/>
-                    <a:ln>
-                      <a:noFill/>
-                    </a:ln>
-                  </pic:spPr>
-                </pic:pic>
-              </a:graphicData>
-            </a:graphic>
-          </wp:inline>
-        </w:drawing>
-      </w:r>
-    </w:p>
-    <w:p>
-      <w:pPr>
-        <w:pStyle w:val="Paragraphedeliste"/>
-        <w:ind w:left="936"/>
-      </w:pPr>
-    </w:p>
     <w:p/>
     <w:p>
       <w:pPr>
         <w:pStyle w:val="Titre2"/>
       </w:pPr>
-      <w:bookmarkStart w:id="7" w:name="_Toc204255500"/>
-      <w:r>
+      <w:bookmarkStart w:id="7" w:name="_Toc219407373"/>
+      <w:r>
+        <w:lastRenderedPageBreak/>
         <w:t>Suppression d’une barre d’outils</w:t>
       </w:r>
       <w:bookmarkEnd w:id="7"/>
@@ -2809,7 +2807,7 @@
                     </pic:cNvPicPr>
                   </pic:nvPicPr>
                   <pic:blipFill>
-                    <a:blip r:embed="rId18">
+                    <a:blip r:embed="rId17">
                       <a:extLst>
                         <a:ext uri="{28A0092B-C50C-407E-A947-70E740481C1C}">
                           <a14:useLocalDpi xmlns:a14="http://schemas.microsoft.com/office/drawing/2010/main" val="0"/>
@@ -2853,25 +2851,303 @@
     <w:p/>
     <w:p>
       <w:pPr>
+        <w:pStyle w:val="Titre2"/>
+      </w:pPr>
+      <w:bookmarkStart w:id="8" w:name="_Toc219407374"/>
+      <w:r>
+        <w:t>Renommer une barre d’outils</w:t>
+      </w:r>
+      <w:bookmarkEnd w:id="8"/>
+    </w:p>
+    <w:p>
+      <w:pPr>
+        <w:ind w:left="432"/>
+      </w:pPr>
+    </w:p>
+    <w:p>
+      <w:pPr>
+        <w:ind w:left="432"/>
+      </w:pPr>
+      <w:r>
+        <w:t>Il faut sélectionner la barre à renommer puis cliquer sur « renommer la barre d’outils sélectionner »</w:t>
+      </w:r>
+    </w:p>
+    <w:p>
+      <w:pPr>
+        <w:ind w:left="432"/>
+      </w:pPr>
+      <w:r>
+        <w:t>Un dialogue s’ouvre, l’ancien nom apparait, il suffit de le modifier.</w:t>
+      </w:r>
+    </w:p>
+    <w:p>
+      <w:pPr>
+        <w:ind w:left="432"/>
+      </w:pPr>
+    </w:p>
+    <w:p>
+      <w:pPr>
+        <w:ind w:left="432"/>
+        <w:jc w:val="center"/>
+      </w:pPr>
+      <w:r>
+        <w:rPr>
+          <w:noProof/>
+        </w:rPr>
+        <w:drawing>
+          <wp:inline distT="0" distB="0" distL="0" distR="0" wp14:anchorId="10DA67E1" wp14:editId="5AA772C2">
+            <wp:extent cx="1539373" cy="937341"/>
+            <wp:effectExtent l="0" t="0" r="3810" b="0"/>
+            <wp:docPr id="9" name="Image 9" descr="Une image contenant texte, capture d’écran, Police, nombre&#10;&#10;Description générée automatiquement"/>
+            <wp:cNvGraphicFramePr>
+              <a:graphicFrameLocks xmlns:a="http://schemas.openxmlformats.org/drawingml/2006/main" noChangeAspect="1"/>
+            </wp:cNvGraphicFramePr>
+            <a:graphic xmlns:a="http://schemas.openxmlformats.org/drawingml/2006/main">
+              <a:graphicData uri="http://schemas.openxmlformats.org/drawingml/2006/picture">
+                <pic:pic xmlns:pic="http://schemas.openxmlformats.org/drawingml/2006/picture">
+                  <pic:nvPicPr>
+                    <pic:cNvPr id="9" name="Image 9" descr="Une image contenant texte, capture d’écran, Police, nombre&#10;&#10;Description générée automatiquement"/>
+                    <pic:cNvPicPr/>
+                  </pic:nvPicPr>
+                  <pic:blipFill>
+                    <a:blip r:embed="rId18">
+                      <a:extLst>
+                        <a:ext uri="{28A0092B-C50C-407E-A947-70E740481C1C}">
+                          <a14:useLocalDpi xmlns:a14="http://schemas.microsoft.com/office/drawing/2010/main" val="0"/>
+                        </a:ext>
+                      </a:extLst>
+                    </a:blip>
+                    <a:stretch>
+                      <a:fillRect/>
+                    </a:stretch>
+                  </pic:blipFill>
+                  <pic:spPr>
+                    <a:xfrm>
+                      <a:off x="0" y="0"/>
+                      <a:ext cx="1539373" cy="937341"/>
+                    </a:xfrm>
+                    <a:prstGeom prst="rect">
+                      <a:avLst/>
+                    </a:prstGeom>
+                  </pic:spPr>
+                </pic:pic>
+              </a:graphicData>
+            </a:graphic>
+          </wp:inline>
+        </w:drawing>
+      </w:r>
+    </w:p>
+    <w:p>
+      <w:pPr>
+        <w:ind w:left="432"/>
+      </w:pPr>
+    </w:p>
+    <w:p>
+      <w:pPr>
+        <w:ind w:left="432"/>
+      </w:pPr>
+    </w:p>
+    <w:p>
+      <w:pPr>
+        <w:ind w:left="432"/>
+      </w:pPr>
+    </w:p>
+    <w:p>
+      <w:pPr>
+        <w:ind w:left="432"/>
+      </w:pPr>
+    </w:p>
+    <w:p>
+      <w:pPr>
+        <w:ind w:left="432"/>
+      </w:pPr>
+    </w:p>
+    <w:p>
+      <w:pPr>
+        <w:ind w:left="432"/>
+      </w:pPr>
+    </w:p>
+    <w:p>
+      <w:pPr>
+        <w:ind w:left="432"/>
+      </w:pPr>
+    </w:p>
+    <w:p>
+      <w:pPr>
+        <w:ind w:left="432"/>
+      </w:pPr>
+    </w:p>
+    <w:p>
+      <w:pPr>
+        <w:ind w:left="432"/>
+      </w:pPr>
+    </w:p>
+    <w:p>
+      <w:pPr>
+        <w:ind w:left="432"/>
+      </w:pPr>
+    </w:p>
+    <w:p>
+      <w:pPr>
+        <w:ind w:left="432"/>
+      </w:pPr>
+    </w:p>
+    <w:p>
+      <w:pPr>
+        <w:ind w:left="432"/>
+      </w:pPr>
+    </w:p>
+    <w:p>
+      <w:pPr>
+        <w:ind w:left="432"/>
+      </w:pPr>
+    </w:p>
+    <w:p>
+      <w:pPr>
+        <w:ind w:left="432"/>
+      </w:pPr>
+    </w:p>
+    <w:p>
+      <w:pPr>
+        <w:ind w:left="432"/>
+      </w:pPr>
+    </w:p>
+    <w:p>
+      <w:pPr>
+        <w:ind w:left="432"/>
+      </w:pPr>
+    </w:p>
+    <w:p>
+      <w:pPr>
+        <w:ind w:left="432"/>
+      </w:pPr>
+    </w:p>
+    <w:p>
+      <w:pPr>
+        <w:ind w:left="432"/>
+      </w:pPr>
+    </w:p>
+    <w:p>
+      <w:pPr>
+        <w:ind w:left="432"/>
+      </w:pPr>
+    </w:p>
+    <w:p>
+      <w:pPr>
+        <w:ind w:left="432"/>
+      </w:pPr>
+    </w:p>
+    <w:p>
+      <w:pPr>
+        <w:ind w:left="432"/>
+      </w:pPr>
+    </w:p>
+    <w:p>
+      <w:pPr>
+        <w:ind w:left="432"/>
+      </w:pPr>
+    </w:p>
+    <w:p>
+      <w:pPr>
+        <w:ind w:left="432"/>
+      </w:pPr>
+    </w:p>
+    <w:p>
+      <w:pPr>
+        <w:ind w:left="432"/>
+      </w:pPr>
+    </w:p>
+    <w:p>
+      <w:pPr>
+        <w:ind w:left="432"/>
+      </w:pPr>
+    </w:p>
+    <w:p>
+      <w:pPr>
+        <w:ind w:left="432"/>
+      </w:pPr>
+    </w:p>
+    <w:p>
+      <w:pPr>
+        <w:ind w:left="432"/>
+      </w:pPr>
+    </w:p>
+    <w:p>
+      <w:pPr>
+        <w:ind w:left="432"/>
+      </w:pPr>
+    </w:p>
+    <w:p>
+      <w:pPr>
+        <w:ind w:left="432"/>
+      </w:pPr>
+    </w:p>
+    <w:p>
+      <w:pPr>
+        <w:ind w:left="432"/>
+      </w:pPr>
+    </w:p>
+    <w:p>
+      <w:pPr>
+        <w:ind w:left="432"/>
+      </w:pPr>
+    </w:p>
+    <w:p>
+      <w:pPr>
+        <w:ind w:left="432"/>
+      </w:pPr>
+    </w:p>
+    <w:p>
+      <w:pPr>
+        <w:ind w:left="432"/>
+      </w:pPr>
+    </w:p>
+    <w:p>
+      <w:pPr>
+        <w:ind w:left="432"/>
+      </w:pPr>
+    </w:p>
+    <w:p>
+      <w:pPr>
+        <w:ind w:left="432"/>
+      </w:pPr>
+    </w:p>
+    <w:p>
+      <w:pPr>
+        <w:ind w:left="432"/>
+      </w:pPr>
+    </w:p>
+    <w:p>
+      <w:pPr>
+        <w:ind w:left="432"/>
+      </w:pPr>
+    </w:p>
+    <w:p>
+      <w:pPr>
+        <w:ind w:left="432"/>
+      </w:pPr>
+    </w:p>
+    <w:p>
+      <w:pPr>
         <w:pStyle w:val="Titre1"/>
       </w:pPr>
-      <w:bookmarkStart w:id="8" w:name="_Toc204255501"/>
       <w:bookmarkStart w:id="9" w:name="_Toc215049623"/>
+      <w:bookmarkStart w:id="10" w:name="_Toc219407375"/>
       <w:r>
         <w:t>Résultat sous QGIS</w:t>
       </w:r>
-      <w:bookmarkEnd w:id="8"/>
+      <w:bookmarkEnd w:id="10"/>
     </w:p>
     <w:p/>
     <w:p>
       <w:pPr>
         <w:pStyle w:val="Titre2"/>
       </w:pPr>
-      <w:bookmarkStart w:id="10" w:name="_Toc204255502"/>
+      <w:bookmarkStart w:id="11" w:name="_Toc219407376"/>
       <w:r>
         <w:t>Menu IGN</w:t>
       </w:r>
-      <w:bookmarkEnd w:id="10"/>
+      <w:bookmarkEnd w:id="11"/>
     </w:p>
     <w:p>
       <w:pPr>
@@ -2882,8 +3158,13 @@
       <w:pPr>
         <w:ind w:left="432"/>
       </w:pPr>
-      <w:r>
-        <w:t>Apres toutes ces étapes on se retrouve avec un menu « IGN » </w:t>
+      <w:proofErr w:type="gramStart"/>
+      <w:r>
+        <w:t>Apres</w:t>
+      </w:r>
+      <w:proofErr w:type="gramEnd"/>
+      <w:r>
+        <w:t xml:space="preserve"> toutes ces étapes on se retrouve avec un menu « IGN » </w:t>
       </w:r>
       <w:r>
         <w:t>contenant :</w:t>
@@ -2969,11 +3250,11 @@
       <w:r>
         <w:tab/>
       </w:r>
-      <w:bookmarkStart w:id="11" w:name="_Toc204255503"/>
+      <w:bookmarkStart w:id="12" w:name="_Toc219407377"/>
       <w:r>
         <w:t>Barres d’outils</w:t>
       </w:r>
-      <w:bookmarkEnd w:id="11"/>
+      <w:bookmarkEnd w:id="12"/>
     </w:p>
     <w:p>
       <w:pPr>
@@ -3010,10 +3291,10 @@
           <w:noProof/>
         </w:rPr>
         <w:drawing>
-          <wp:inline distT="0" distB="0" distL="0" distR="0" wp14:anchorId="77AB78FE" wp14:editId="2BCF98E8">
-            <wp:extent cx="2857500" cy="304800"/>
-            <wp:effectExtent l="0" t="0" r="0" b="0"/>
-            <wp:docPr id="30" name="Image 30"/>
+          <wp:inline distT="0" distB="0" distL="0" distR="0" wp14:anchorId="4447697E" wp14:editId="1D52A297">
+            <wp:extent cx="5159187" cy="281964"/>
+            <wp:effectExtent l="0" t="0" r="3810" b="3810"/>
+            <wp:docPr id="6" name="Image 6"/>
             <wp:cNvGraphicFramePr>
               <a:graphicFrameLocks xmlns:a="http://schemas.openxmlformats.org/drawingml/2006/main" noChangeAspect="1"/>
             </wp:cNvGraphicFramePr>
@@ -3021,10 +3302,8 @@
               <a:graphicData uri="http://schemas.openxmlformats.org/drawingml/2006/picture">
                 <pic:pic xmlns:pic="http://schemas.openxmlformats.org/drawingml/2006/picture">
                   <pic:nvPicPr>
-                    <pic:cNvPr id="0" name="Picture 5"/>
-                    <pic:cNvPicPr>
-                      <a:picLocks noChangeAspect="1" noChangeArrowheads="1"/>
-                    </pic:cNvPicPr>
+                    <pic:cNvPr id="6" name="Image 6"/>
+                    <pic:cNvPicPr/>
                   </pic:nvPicPr>
                   <pic:blipFill>
                     <a:blip r:embed="rId20">
@@ -3034,23 +3313,18 @@
                         </a:ext>
                       </a:extLst>
                     </a:blip>
-                    <a:srcRect/>
                     <a:stretch>
                       <a:fillRect/>
                     </a:stretch>
                   </pic:blipFill>
-                  <pic:spPr bwMode="auto">
+                  <pic:spPr>
                     <a:xfrm>
                       <a:off x="0" y="0"/>
-                      <a:ext cx="2857500" cy="304800"/>
+                      <a:ext cx="5159187" cy="281964"/>
                     </a:xfrm>
                     <a:prstGeom prst="rect">
                       <a:avLst/>
                     </a:prstGeom>
-                    <a:noFill/>
-                    <a:ln>
-                      <a:noFill/>
-                    </a:ln>
                   </pic:spPr>
                 </pic:pic>
               </a:graphicData>
@@ -3076,10 +3350,10 @@
           <w:noProof/>
         </w:rPr>
         <w:drawing>
-          <wp:inline distT="0" distB="0" distL="0" distR="0" wp14:anchorId="1185145D" wp14:editId="3044274D">
-            <wp:extent cx="3185160" cy="1828800"/>
-            <wp:effectExtent l="0" t="0" r="0" b="0"/>
-            <wp:docPr id="31" name="Image 31"/>
+          <wp:inline distT="0" distB="0" distL="0" distR="0" wp14:anchorId="1F90BF19" wp14:editId="0CBAC404">
+            <wp:extent cx="2987299" cy="1447925"/>
+            <wp:effectExtent l="0" t="0" r="3810" b="0"/>
+            <wp:docPr id="7" name="Image 7" descr="Une image contenant texte, capture d’écran, Police&#10;&#10;Description générée automatiquement"/>
             <wp:cNvGraphicFramePr>
               <a:graphicFrameLocks xmlns:a="http://schemas.openxmlformats.org/drawingml/2006/main" noChangeAspect="1"/>
             </wp:cNvGraphicFramePr>
@@ -3087,10 +3361,8 @@
               <a:graphicData uri="http://schemas.openxmlformats.org/drawingml/2006/picture">
                 <pic:pic xmlns:pic="http://schemas.openxmlformats.org/drawingml/2006/picture">
                   <pic:nvPicPr>
-                    <pic:cNvPr id="0" name="Picture 6"/>
-                    <pic:cNvPicPr>
-                      <a:picLocks noChangeAspect="1" noChangeArrowheads="1"/>
-                    </pic:cNvPicPr>
+                    <pic:cNvPr id="7" name="Image 7" descr="Une image contenant texte, capture d’écran, Police&#10;&#10;Description générée automatiquement"/>
+                    <pic:cNvPicPr/>
                   </pic:nvPicPr>
                   <pic:blipFill>
                     <a:blip r:embed="rId21">
@@ -3100,23 +3372,18 @@
                         </a:ext>
                       </a:extLst>
                     </a:blip>
-                    <a:srcRect/>
                     <a:stretch>
                       <a:fillRect/>
                     </a:stretch>
                   </pic:blipFill>
-                  <pic:spPr bwMode="auto">
+                  <pic:spPr>
                     <a:xfrm>
                       <a:off x="0" y="0"/>
-                      <a:ext cx="3185160" cy="1828800"/>
+                      <a:ext cx="2987299" cy="1447925"/>
                     </a:xfrm>
                     <a:prstGeom prst="rect">
                       <a:avLst/>
                     </a:prstGeom>
-                    <a:noFill/>
-                    <a:ln>
-                      <a:noFill/>
-                    </a:ln>
                   </pic:spPr>
                 </pic:pic>
               </a:graphicData>
@@ -3362,7 +3629,7 @@
             <w:tag w:val="_DCDateCreated"/>
             <w:id w:val="317545533"/>
             <w:dataBinding w:prefixMappings="xmlns:ns0='http://schemas.microsoft.com/office/2006/metadata/properties' xmlns:ns1='http://www.w3.org/2001/XMLSchema-instance' xmlns:ns2='http://schemas.microsoft.com/office/infopath/2007/PartnerControls' xmlns:ns3='a1322699-2fbb-4cce-8aba-176c4fa97253' xmlns:ns4='http://schemas.microsoft.com/sharepoint/v3' xmlns:ns5='http://schemas.microsoft.com/sharepoint/v3/fields' xmlns:ns6='f0ff482e-aa3b-417e-9d65-5f4cb2656651' " w:xpath="/ns0:properties[1]/documentManagement[1]/ns5:_DCDateCreated[1]" w:storeItemID="{1159403A-C237-488E-8C5E-DABF9FCE7043}"/>
-            <w:date w:fullDate="2025-09-18T00:00:00Z">
+            <w:date w:fullDate="2026-01-15T00:00:00Z">
               <w:dateFormat w:val="dd/MM/yyyy"/>
               <w:lid w:val="fr-FR"/>
               <w:storeMappedDataAs w:val="dateTime"/>
@@ -3396,17 +3663,7 @@
                   <w:sz w:val="16"/>
                   <w:szCs w:val="16"/>
                 </w:rPr>
-                <w:t>18/09</w:t>
-              </w:r>
-              <w:r>
-                <w:rPr>
-                  <w:rFonts w:eastAsia="Calibri"/>
-                  <w:noProof/>
-                  <w:color w:val="002060"/>
-                  <w:sz w:val="16"/>
-                  <w:szCs w:val="16"/>
-                </w:rPr>
-                <w:t>/2025</w:t>
+                <w:t>15/01/2026</w:t>
               </w:r>
             </w:p>
           </w:sdtContent>
@@ -6153,14 +6410,14 @@
     <w:charset w:val="00"/>
     <w:family w:val="swiss"/>
     <w:pitch w:val="variable"/>
-    <w:sig w:usb0="E0002EFF" w:usb1="C000785B" w:usb2="00000009" w:usb3="00000000" w:csb0="000001FF" w:csb1="00000000"/>
+    <w:sig w:usb0="E0002AFF" w:usb1="C0007843" w:usb2="00000009" w:usb3="00000000" w:csb0="000001FF" w:csb1="00000000"/>
   </w:font>
   <w:font w:name="Calibri">
     <w:panose1 w:val="020F0502020204030204"/>
     <w:charset w:val="00"/>
     <w:family w:val="swiss"/>
     <w:pitch w:val="variable"/>
-    <w:sig w:usb0="E4002EFF" w:usb1="C000247B" w:usb2="00000009" w:usb3="00000000" w:csb0="000001FF" w:csb1="00000000"/>
+    <w:sig w:usb0="E0002AFF" w:usb1="4000ACFF" w:usb2="00000001" w:usb3="00000000" w:csb0="000001FF" w:csb1="00000000"/>
   </w:font>
   <w:font w:name="Courier New">
     <w:panose1 w:val="02070309020205020404"/>
@@ -6174,7 +6431,7 @@
     <w:charset w:val="00"/>
     <w:family w:val="roman"/>
     <w:pitch w:val="variable"/>
-    <w:sig w:usb0="E0002EFF" w:usb1="C000785B" w:usb2="00000009" w:usb3="00000000" w:csb0="000001FF" w:csb1="00000000"/>
+    <w:sig w:usb0="E0002AFF" w:usb1="C0007843" w:usb2="00000009" w:usb3="00000000" w:csb0="000001FF" w:csb1="00000000"/>
   </w:font>
   <w:font w:name="Wingdings">
     <w:panose1 w:val="05000000000000000000"/>
@@ -6216,7 +6473,7 @@
     <w:charset w:val="00"/>
     <w:family w:val="swiss"/>
     <w:pitch w:val="variable"/>
-    <w:sig w:usb0="E4002EFF" w:usb1="C000247B" w:usb2="00000009" w:usb3="00000000" w:csb0="000001FF" w:csb1="00000000"/>
+    <w:sig w:usb0="A0002AEF" w:usb1="4000207B" w:usb2="00000000" w:usb3="00000000" w:csb0="000001FF" w:csb1="00000000"/>
   </w:font>
 </w:fonts>
 </file>
@@ -6242,6 +6499,7 @@
     <w:rsid w:val="000D4DEE"/>
     <w:rsid w:val="00162DC9"/>
     <w:rsid w:val="001B3457"/>
+    <w:rsid w:val="00226DE5"/>
     <w:rsid w:val="003259A4"/>
     <w:rsid w:val="00464909"/>
     <w:rsid w:val="00471113"/>
@@ -7039,6 +7297,15 @@
 </file>
 
 <file path=customXml/item1.xml><?xml version="1.0" encoding="utf-8"?>
+<?mso-contentType ?>
+<FormTemplates xmlns="http://schemas.microsoft.com/sharepoint/v3/contenttype/forms">
+  <Display>DocumentLibraryForm</Display>
+  <Edit>DocumentLibraryForm</Edit>
+  <New>DocumentLibraryForm</New>
+</FormTemplates>
+</file>
+
+<file path=customXml/item2.xml><?xml version="1.0" encoding="utf-8"?>
 <ct:contentTypeSchema xmlns:ct="http://schemas.microsoft.com/office/2006/metadata/contentType" xmlns:ma="http://schemas.microsoft.com/office/2006/metadata/properties/metaAttributes" ct:_="" ma:_="" ma:contentTypeName="Document" ma:contentTypeID="0x010100A3FA4CB5114F4B43B99F0B6DC8751D90" ma:contentTypeVersion="10" ma:contentTypeDescription="Crée un document." ma:contentTypeScope="" ma:versionID="501205be520febb413c56432ff8e6df1">
   <xsd:schema xmlns:xsd="http://www.w3.org/2001/XMLSchema" xmlns:xs="http://www.w3.org/2001/XMLSchema" xmlns:p="http://schemas.microsoft.com/office/2006/metadata/properties" xmlns:ns2="b295003c-aa87-407e-9024-fdee4e88f6fa" targetNamespace="http://schemas.microsoft.com/office/2006/metadata/properties" ma:root="true" ma:fieldsID="0378f5bf275aa5e8e5bb75b38d3da7db" ns2:_="">
     <xsd:import namespace="b295003c-aa87-407e-9024-fdee4e88f6fa"/>
@@ -7216,16 +7483,11 @@
 </ct:contentTypeSchema>
 </file>
 
-<file path=customXml/item2.xml><?xml version="1.0" encoding="utf-8"?>
-<?mso-contentType ?>
-<FormTemplates xmlns="http://schemas.microsoft.com/sharepoint/v3/contenttype/forms">
-  <Display>DocumentLibraryForm</Display>
-  <Edit>DocumentLibraryForm</Edit>
-  <New>DocumentLibraryForm</New>
-</FormTemplates>
+<file path=customXml/item3.xml><?xml version="1.0" encoding="utf-8"?>
+<b:Sources xmlns:b="http://schemas.openxmlformats.org/officeDocument/2006/bibliography" xmlns="http://schemas.openxmlformats.org/officeDocument/2006/bibliography" SelectedStyle="\APA.XSL" StyleName="APA"/>
 </file>
 
-<file path=customXml/item3.xml><?xml version="1.0" encoding="utf-8"?>
+<file path=customXml/item4.xml><?xml version="1.0" encoding="utf-8"?>
 <p:properties xmlns:p="http://schemas.microsoft.com/office/2006/metadata/properties" xmlns:xsi="http://www.w3.org/2001/XMLSchema-instance" xmlns:pc="http://schemas.microsoft.com/office/infopath/2007/PartnerControls">
   <documentManagement>
     <lcf76f155ced4ddcb4097134ff3c332f xmlns="b295003c-aa87-407e-9024-fdee4e88f6fa">
@@ -7235,11 +7497,15 @@
 </p:properties>
 </file>
 
-<file path=customXml/item4.xml><?xml version="1.0" encoding="utf-8"?>
-<b:Sources xmlns:b="http://schemas.openxmlformats.org/officeDocument/2006/bibliography" xmlns="http://schemas.openxmlformats.org/officeDocument/2006/bibliography" SelectedStyle="\APA.XSL" StyleName="APA"/>
+<file path=customXml/itemProps1.xml><?xml version="1.0" encoding="utf-8"?>
+<ds:datastoreItem xmlns:ds="http://schemas.openxmlformats.org/officeDocument/2006/customXml" ds:itemID="{EEE2973D-7DD7-4773-855D-5CAD81242BDE}">
+  <ds:schemaRefs>
+    <ds:schemaRef ds:uri="http://schemas.microsoft.com/sharepoint/v3/contenttype/forms"/>
+  </ds:schemaRefs>
+</ds:datastoreItem>
 </file>
 
-<file path=customXml/itemProps1.xml><?xml version="1.0" encoding="utf-8"?>
+<file path=customXml/itemProps2.xml><?xml version="1.0" encoding="utf-8"?>
 <ds:datastoreItem xmlns:ds="http://schemas.openxmlformats.org/officeDocument/2006/customXml" ds:itemID="{0B65258C-9CEC-414A-989C-54F659AC270E}">
   <ds:schemaRefs>
     <ds:schemaRef ds:uri="http://schemas.microsoft.com/office/2006/metadata/contentType"/>
@@ -7257,15 +7523,15 @@
 </ds:datastoreItem>
 </file>
 
-<file path=customXml/itemProps2.xml><?xml version="1.0" encoding="utf-8"?>
-<ds:datastoreItem xmlns:ds="http://schemas.openxmlformats.org/officeDocument/2006/customXml" ds:itemID="{EEE2973D-7DD7-4773-855D-5CAD81242BDE}">
+<file path=customXml/itemProps3.xml><?xml version="1.0" encoding="utf-8"?>
+<ds:datastoreItem xmlns:ds="http://schemas.openxmlformats.org/officeDocument/2006/customXml" ds:itemID="{0FF0F878-5F0F-460C-9013-40E72731A637}">
   <ds:schemaRefs>
-    <ds:schemaRef ds:uri="http://schemas.microsoft.com/sharepoint/v3/contenttype/forms"/>
+    <ds:schemaRef ds:uri="http://schemas.openxmlformats.org/officeDocument/2006/bibliography"/>
   </ds:schemaRefs>
 </ds:datastoreItem>
 </file>
 
-<file path=customXml/itemProps3.xml><?xml version="1.0" encoding="utf-8"?>
+<file path=customXml/itemProps4.xml><?xml version="1.0" encoding="utf-8"?>
 <ds:datastoreItem xmlns:ds="http://schemas.openxmlformats.org/officeDocument/2006/customXml" ds:itemID="{1159403A-C237-488E-8C5E-DABF9FCE7043}">
   <ds:schemaRefs>
     <ds:schemaRef ds:uri="http://schemas.microsoft.com/office/2006/metadata/properties"/>
@@ -7273,12 +7539,4 @@
     <ds:schemaRef ds:uri="b295003c-aa87-407e-9024-fdee4e88f6fa"/>
   </ds:schemaRefs>
 </ds:datastoreItem>
-</file>
-
-<file path=customXml/itemProps4.xml><?xml version="1.0" encoding="utf-8"?>
-<ds:datastoreItem xmlns:ds="http://schemas.openxmlformats.org/officeDocument/2006/customXml" ds:itemID="{0FF0F878-5F0F-460C-9013-40E72731A637}">
-  <ds:schemaRefs>
-    <ds:schemaRef ds:uri="http://schemas.openxmlformats.org/officeDocument/2006/bibliography"/>
-  </ds:schemaRefs>
-</ds:datastoreItem>
 </file>
</xml_diff>

<commit_message>
ajout d'une notification de packages manquants
</commit_message>
<xml_diff>
--- a/plugin_maitre.docx
+++ b/plugin_maitre.docx
@@ -115,7 +115,7 @@
                 <w:sz w:val="28"/>
                 <w:szCs w:val="28"/>
               </w:rPr>
-              <w:t>Plugin QGis Maitre</w:t>
+              <w:t>Plugin Maitre</w:t>
             </w:r>
             <w:r>
               <w:rPr>
@@ -135,7 +135,27 @@
                 <w:sz w:val="28"/>
                 <w:szCs w:val="28"/>
               </w:rPr>
-              <w:t>1.4.0</w:t>
+              <w:t>1.</w:t>
+            </w:r>
+            <w:r>
+              <w:rPr>
+                <w:rFonts w:ascii="Times New Roman" w:hAnsi="Times New Roman" w:cs="Times New Roman"/>
+                <w:b/>
+                <w:noProof/>
+                <w:sz w:val="28"/>
+                <w:szCs w:val="28"/>
+              </w:rPr>
+              <w:t>5</w:t>
+            </w:r>
+            <w:r>
+              <w:rPr>
+                <w:rFonts w:ascii="Times New Roman" w:hAnsi="Times New Roman" w:cs="Times New Roman"/>
+                <w:b/>
+                <w:noProof/>
+                <w:sz w:val="28"/>
+                <w:szCs w:val="28"/>
+              </w:rPr>
+              <w:t>.0</w:t>
             </w:r>
           </w:p>
         </w:tc>
@@ -307,7 +327,7 @@
           <w:r>
             <w:fldChar w:fldCharType="separate"/>
           </w:r>
-          <w:hyperlink w:anchor="_Toc224313223" w:history="1">
+          <w:hyperlink w:anchor="_Toc227263431" w:history="1">
             <w:r>
               <w:rPr>
                 <w:rStyle w:val="Lienhypertexte"/>
@@ -347,7 +367,7 @@
               <w:rPr>
                 <w:webHidden/>
               </w:rPr>
-              <w:instrText xml:space="preserve"> PAGEREF _Toc224313223 \h </w:instrText>
+              <w:instrText xml:space="preserve"> PAGEREF _Toc227263431 \h </w:instrText>
             </w:r>
             <w:r>
               <w:rPr>
@@ -364,7 +384,7 @@
               <w:rPr>
                 <w:webHidden/>
               </w:rPr>
-              <w:t>2</w:t>
+              <w:t>1</w:t>
             </w:r>
             <w:r>
               <w:rPr>
@@ -386,7 +406,7 @@
               <w14:ligatures w14:val="standardContextual"/>
             </w:rPr>
           </w:pPr>
-          <w:hyperlink w:anchor="_Toc224313224" w:history="1">
+          <w:hyperlink w:anchor="_Toc227263432" w:history="1">
             <w:r>
               <w:rPr>
                 <w:rStyle w:val="Lienhypertexte"/>
@@ -426,7 +446,7 @@
               <w:rPr>
                 <w:webHidden/>
               </w:rPr>
-              <w:instrText xml:space="preserve"> PAGEREF _Toc224313224 \h </w:instrText>
+              <w:instrText xml:space="preserve"> PAGEREF _Toc227263432 \h </w:instrText>
             </w:r>
             <w:r>
               <w:rPr>
@@ -443,7 +463,7 @@
               <w:rPr>
                 <w:webHidden/>
               </w:rPr>
-              <w:t>2</w:t>
+              <w:t>1</w:t>
             </w:r>
             <w:r>
               <w:rPr>
@@ -465,7 +485,7 @@
               <w14:ligatures w14:val="standardContextual"/>
             </w:rPr>
           </w:pPr>
-          <w:hyperlink w:anchor="_Toc224313225" w:history="1">
+          <w:hyperlink w:anchor="_Toc227263433" w:history="1">
             <w:r>
               <w:rPr>
                 <w:rStyle w:val="Lienhypertexte"/>
@@ -505,7 +525,7 @@
               <w:rPr>
                 <w:webHidden/>
               </w:rPr>
-              <w:instrText xml:space="preserve"> PAGEREF _Toc224313225 \h </w:instrText>
+              <w:instrText xml:space="preserve"> PAGEREF _Toc227263433 \h </w:instrText>
             </w:r>
             <w:r>
               <w:rPr>
@@ -544,7 +564,7 @@
               <w14:ligatures w14:val="standardContextual"/>
             </w:rPr>
           </w:pPr>
-          <w:hyperlink w:anchor="_Toc224313226" w:history="1">
+          <w:hyperlink w:anchor="_Toc227263434" w:history="1">
             <w:r>
               <w:rPr>
                 <w:rStyle w:val="Lienhypertexte"/>
@@ -584,7 +604,7 @@
               <w:rPr>
                 <w:webHidden/>
               </w:rPr>
-              <w:instrText xml:space="preserve"> PAGEREF _Toc224313226 \h </w:instrText>
+              <w:instrText xml:space="preserve"> PAGEREF _Toc227263434 \h </w:instrText>
             </w:r>
             <w:r>
               <w:rPr>
@@ -622,7 +642,7 @@
               <w14:ligatures w14:val="standardContextual"/>
             </w:rPr>
           </w:pPr>
-          <w:hyperlink w:anchor="_Toc224313227" w:history="1">
+          <w:hyperlink w:anchor="_Toc227263435" w:history="1">
             <w:r>
               <w:rPr>
                 <w:rStyle w:val="Lienhypertexte"/>
@@ -661,7 +681,7 @@
               <w:rPr>
                 <w:webHidden/>
               </w:rPr>
-              <w:instrText xml:space="preserve"> PAGEREF _Toc224313227 \h </w:instrText>
+              <w:instrText xml:space="preserve"> PAGEREF _Toc227263435 \h </w:instrText>
             </w:r>
             <w:r>
               <w:rPr>
@@ -678,7 +698,7 @@
               <w:rPr>
                 <w:webHidden/>
               </w:rPr>
-              <w:t>3</w:t>
+              <w:t>2</w:t>
             </w:r>
             <w:r>
               <w:rPr>
@@ -699,7 +719,7 @@
               <w14:ligatures w14:val="standardContextual"/>
             </w:rPr>
           </w:pPr>
-          <w:hyperlink w:anchor="_Toc224313228" w:history="1">
+          <w:hyperlink w:anchor="_Toc227263436" w:history="1">
             <w:r>
               <w:rPr>
                 <w:rStyle w:val="Lienhypertexte"/>
@@ -738,7 +758,7 @@
               <w:rPr>
                 <w:webHidden/>
               </w:rPr>
-              <w:instrText xml:space="preserve"> PAGEREF _Toc224313228 \h </w:instrText>
+              <w:instrText xml:space="preserve"> PAGEREF _Toc227263436 \h </w:instrText>
             </w:r>
             <w:r>
               <w:rPr>
@@ -776,7 +796,7 @@
               <w14:ligatures w14:val="standardContextual"/>
             </w:rPr>
           </w:pPr>
-          <w:hyperlink w:anchor="_Toc224313229" w:history="1">
+          <w:hyperlink w:anchor="_Toc227263437" w:history="1">
             <w:r>
               <w:rPr>
                 <w:rStyle w:val="Lienhypertexte"/>
@@ -815,7 +835,7 @@
               <w:rPr>
                 <w:webHidden/>
               </w:rPr>
-              <w:instrText xml:space="preserve"> PAGEREF _Toc224313229 \h </w:instrText>
+              <w:instrText xml:space="preserve"> PAGEREF _Toc227263437 \h </w:instrText>
             </w:r>
             <w:r>
               <w:rPr>
@@ -866,29 +886,12 @@
     <w:p/>
     <w:p/>
     <w:p/>
-    <w:p/>
-    <w:p/>
-    <w:p/>
-    <w:p/>
-    <w:p/>
-    <w:p/>
-    <w:p/>
-    <w:p/>
-    <w:p/>
-    <w:p/>
-    <w:p/>
-    <w:p/>
-    <w:p/>
-    <w:p/>
-    <w:p/>
-    <w:p/>
     <w:p>
       <w:pPr>
         <w:pStyle w:val="Titre1"/>
       </w:pPr>
-      <w:bookmarkStart w:id="0" w:name="_Toc224313223"/>
-      <w:r>
-        <w:lastRenderedPageBreak/>
+      <w:bookmarkStart w:id="0" w:name="_Toc227263431"/>
+      <w:r>
         <w:t>Prérequis</w:t>
       </w:r>
       <w:bookmarkEnd w:id="0"/>
@@ -916,7 +919,7 @@
         <w:ind w:firstLine="432"/>
       </w:pPr>
       <w:r>
-        <w:t>Attention : le plugin ne fonctionne pas avec la version 4 de QGIS</w:t>
+        <w:t>Cette version est compatible QGIS 4</w:t>
       </w:r>
     </w:p>
     <w:p/>
@@ -925,7 +928,7 @@
       <w:pPr>
         <w:pStyle w:val="Titre1"/>
       </w:pPr>
-      <w:bookmarkStart w:id="1" w:name="_Toc224313224"/>
+      <w:bookmarkStart w:id="1" w:name="_Toc227263432"/>
       <w:r>
         <w:t>Résumé</w:t>
       </w:r>
@@ -974,8 +977,9 @@
       <w:pPr>
         <w:pStyle w:val="Titre1"/>
       </w:pPr>
-      <w:bookmarkStart w:id="2" w:name="_Toc224313225"/>
-      <w:r>
+      <w:bookmarkStart w:id="2" w:name="_Toc227263433"/>
+      <w:r>
+        <w:lastRenderedPageBreak/>
         <w:t>Installation</w:t>
       </w:r>
       <w:bookmarkEnd w:id="2"/>
@@ -989,38 +993,26 @@
         <w:t>d’installation.</w:t>
       </w:r>
     </w:p>
-    <w:p/>
     <w:p>
-      <w:pPr>
-        <w:pStyle w:val="Titre1"/>
-      </w:pPr>
-      <w:bookmarkStart w:id="3" w:name="_Toc224313226"/>
-      <w:r>
-        <w:t>Présentation</w:t>
-      </w:r>
-      <w:bookmarkEnd w:id="3"/>
-    </w:p>
-    <w:p/>
-    <w:p>
-      <w:pPr>
-        <w:spacing w:before="0" w:after="200" w:line="276" w:lineRule="auto"/>
-        <w:jc w:val="left"/>
-      </w:pPr>
-      <w:bookmarkStart w:id="4" w:name="_Toc215049623"/>
+      <w:r>
+        <w:t>Le plugin détecte si des packages indispensables ne sont pas installés.</w:t>
+      </w:r>
     </w:p>
     <w:p>
+      <w:r>
+        <w:t xml:space="preserve">Si c’est le cas on obtient au lancement du plugin : </w:t>
+      </w:r>
+    </w:p>
+    <w:p>
       <w:pPr>
         <w:jc w:val="center"/>
       </w:pPr>
       <w:r>
-        <w:rPr>
-          <w:noProof/>
-        </w:rPr>
         <w:drawing>
-          <wp:inline distT="0" distB="0" distL="0" distR="0" wp14:anchorId="5C2F7C5C" wp14:editId="0B28FC5F">
-            <wp:extent cx="3244850" cy="2663104"/>
-            <wp:effectExtent l="0" t="0" r="0" b="4445"/>
-            <wp:docPr id="1" name="Image 1"/>
+          <wp:inline distT="0" distB="0" distL="0" distR="0" wp14:anchorId="38E0E19A" wp14:editId="71454AD0">
+            <wp:extent cx="2562225" cy="1727182"/>
+            <wp:effectExtent l="0" t="0" r="0" b="6985"/>
+            <wp:docPr id="1386316930" name="Image 1"/>
             <wp:cNvGraphicFramePr>
               <a:graphicFrameLocks xmlns:a="http://schemas.openxmlformats.org/drawingml/2006/main" noChangeAspect="1"/>
             </wp:cNvGraphicFramePr>
@@ -1028,7 +1020,7 @@
               <a:graphicData uri="http://schemas.openxmlformats.org/drawingml/2006/picture">
                 <pic:pic xmlns:pic="http://schemas.openxmlformats.org/drawingml/2006/picture">
                   <pic:nvPicPr>
-                    <pic:cNvPr id="1" name=""/>
+                    <pic:cNvPr id="1386316930" name=""/>
                     <pic:cNvPicPr/>
                   </pic:nvPicPr>
                   <pic:blipFill>
@@ -1040,7 +1032,7 @@
                   <pic:spPr>
                     <a:xfrm>
                       <a:off x="0" y="0"/>
-                      <a:ext cx="3253940" cy="2670565"/>
+                      <a:ext cx="2569452" cy="1732054"/>
                     </a:xfrm>
                     <a:prstGeom prst="rect">
                       <a:avLst/>
@@ -1053,81 +1045,96 @@
         </w:drawing>
       </w:r>
     </w:p>
+    <w:p/>
     <w:p>
-      <w:pPr>
-        <w:jc w:val="center"/>
-      </w:pPr>
+      <w:r>
+        <w:t>Demandez à votre responsable informatique d’installer ces packages.</w:t>
+      </w:r>
+    </w:p>
+    <w:p/>
+    <w:p>
+      <w:pPr>
+        <w:pStyle w:val="Titre1"/>
+      </w:pPr>
+      <w:bookmarkStart w:id="3" w:name="_Toc227263434"/>
+      <w:r>
+        <w:t>Présentation</w:t>
+      </w:r>
+      <w:bookmarkEnd w:id="3"/>
     </w:p>
     <w:p>
       <w:pPr>
-        <w:ind w:firstLine="708"/>
-      </w:pPr>
-      <w:r>
-        <w:t>L’interface permet d’organiser l’affichage des plugins en les classant dans des onglets.</w:t>
-      </w:r>
+        <w:jc w:val="center"/>
+      </w:pPr>
+      <w:bookmarkStart w:id="4" w:name="_Toc215049623"/>
     </w:p>
     <w:p>
       <w:pPr>
-        <w:ind w:firstLine="708"/>
-      </w:pPr>
+        <w:jc w:val="center"/>
+      </w:pPr>
+      <w:r>
+        <w:drawing>
+          <wp:inline distT="0" distB="0" distL="0" distR="0" wp14:anchorId="74D3E6B5" wp14:editId="2698802C">
+            <wp:extent cx="3295650" cy="2665407"/>
+            <wp:effectExtent l="0" t="0" r="0" b="1905"/>
+            <wp:docPr id="178793183" name="Image 1"/>
+            <wp:cNvGraphicFramePr>
+              <a:graphicFrameLocks xmlns:a="http://schemas.openxmlformats.org/drawingml/2006/main" noChangeAspect="1"/>
+            </wp:cNvGraphicFramePr>
+            <a:graphic xmlns:a="http://schemas.openxmlformats.org/drawingml/2006/main">
+              <a:graphicData uri="http://schemas.openxmlformats.org/drawingml/2006/picture">
+                <pic:pic xmlns:pic="http://schemas.openxmlformats.org/drawingml/2006/picture">
+                  <pic:nvPicPr>
+                    <pic:cNvPr id="178793183" name=""/>
+                    <pic:cNvPicPr/>
+                  </pic:nvPicPr>
+                  <pic:blipFill>
+                    <a:blip r:embed="rId13"/>
+                    <a:stretch>
+                      <a:fillRect/>
+                    </a:stretch>
+                  </pic:blipFill>
+                  <pic:spPr>
+                    <a:xfrm>
+                      <a:off x="0" y="0"/>
+                      <a:ext cx="3299868" cy="2668818"/>
+                    </a:xfrm>
+                    <a:prstGeom prst="rect">
+                      <a:avLst/>
+                    </a:prstGeom>
+                  </pic:spPr>
+                </pic:pic>
+              </a:graphicData>
+            </a:graphic>
+          </wp:inline>
+        </w:drawing>
+      </w:r>
     </w:p>
     <w:p>
       <w:pPr>
-        <w:ind w:firstLine="708"/>
+        <w:jc w:val="center"/>
       </w:pPr>
     </w:p>
     <w:p>
       <w:pPr>
         <w:ind w:firstLine="708"/>
       </w:pPr>
+      <w:r>
+        <w:t>L’interface permet d’organiser l’affichage des plugins en les classant dans des onglets.</w:t>
+      </w:r>
+    </w:p>
+    <w:p/>
+    <w:p>
+      <w:pPr>
+        <w:ind w:firstLine="708"/>
+      </w:pPr>
     </w:p>
     <w:p>
       <w:pPr>
-        <w:ind w:firstLine="708"/>
-      </w:pPr>
-    </w:p>
-    <w:p>
-      <w:pPr>
-        <w:ind w:firstLine="708"/>
-      </w:pPr>
-    </w:p>
-    <w:p>
-      <w:pPr>
-        <w:ind w:firstLine="708"/>
-      </w:pPr>
-    </w:p>
-    <w:p>
-      <w:pPr>
-        <w:ind w:firstLine="708"/>
-      </w:pPr>
-    </w:p>
-    <w:p>
-      <w:pPr>
-        <w:ind w:firstLine="708"/>
-      </w:pPr>
-    </w:p>
-    <w:p>
-      <w:pPr>
-        <w:ind w:firstLine="708"/>
-      </w:pPr>
-    </w:p>
-    <w:p>
-      <w:pPr>
-        <w:ind w:firstLine="708"/>
-      </w:pPr>
-    </w:p>
-    <w:p>
-      <w:pPr>
-        <w:ind w:firstLine="708"/>
-      </w:pPr>
-    </w:p>
-    <w:p>
-      <w:pPr>
         <w:pStyle w:val="Titre2"/>
       </w:pPr>
-      <w:bookmarkStart w:id="5" w:name="_Toc224313227"/>
-      <w:r>
-        <w:lastRenderedPageBreak/>
+      <w:bookmarkStart w:id="5" w:name="_Toc227263435"/>
+      <w:r>
         <w:t>Onglet menu IGN</w:t>
       </w:r>
       <w:bookmarkEnd w:id="5"/>
@@ -1157,12 +1164,20 @@
       <w:pPr>
         <w:ind w:firstLine="708"/>
       </w:pPr>
+      <w:r>
+        <w:br w:type="page"/>
+      </w:r>
     </w:p>
     <w:p>
       <w:pPr>
+        <w:ind w:firstLine="708"/>
+      </w:pPr>
+    </w:p>
+    <w:p>
+      <w:pPr>
         <w:pStyle w:val="Titre2"/>
       </w:pPr>
-      <w:bookmarkStart w:id="6" w:name="_Toc224313228"/>
+      <w:bookmarkStart w:id="6" w:name="_Toc227263436"/>
       <w:r>
         <w:t>Barres d’outils</w:t>
       </w:r>
@@ -1181,6 +1196,9 @@
         <w:t xml:space="preserve">Ajouter une barre d’outils  </w:t>
       </w:r>
       <w:r>
+        <w:rPr>
+          <w:noProof/>
+        </w:rPr>
         <w:drawing>
           <wp:inline distT="0" distB="0" distL="0" distR="0" wp14:anchorId="4316DC9D" wp14:editId="5F1A4036">
             <wp:extent cx="1962424" cy="219106"/>
@@ -1197,7 +1215,7 @@
                     <pic:cNvPicPr/>
                   </pic:nvPicPr>
                   <pic:blipFill>
-                    <a:blip r:embed="rId13"/>
+                    <a:blip r:embed="rId14"/>
                     <a:stretch>
                       <a:fillRect/>
                     </a:stretch>
@@ -1404,6 +1422,7 @@
                             </w:pPr>
                             <w:r>
                               <w:rPr>
+                                <w:noProof/>
                                 <w:color w:val="FFFFFF" w:themeColor="background1"/>
                                 <w14:textFill>
                                   <w14:noFill/>
@@ -1425,7 +1444,7 @@
                                           <pic:cNvPicPr/>
                                         </pic:nvPicPr>
                                         <pic:blipFill>
-                                          <a:blip r:embed="rId14"/>
+                                          <a:blip r:embed="rId15"/>
                                           <a:stretch>
                                             <a:fillRect/>
                                           </a:stretch>
@@ -1483,6 +1502,7 @@
                       </w:pPr>
                       <w:r>
                         <w:rPr>
+                          <w:noProof/>
                           <w:color w:val="FFFFFF" w:themeColor="background1"/>
                           <w14:textFill>
                             <w14:noFill/>
@@ -1504,7 +1524,7 @@
                                     <pic:cNvPicPr/>
                                   </pic:nvPicPr>
                                   <pic:blipFill>
-                                    <a:blip r:embed="rId14"/>
+                                    <a:blip r:embed="rId15"/>
                                     <a:stretch>
                                       <a:fillRect/>
                                     </a:stretch>
@@ -1534,6 +1554,9 @@
         </mc:AlternateContent>
       </w:r>
       <w:r>
+        <w:rPr>
+          <w:noProof/>
+        </w:rPr>
         <w:drawing>
           <wp:inline distT="0" distB="0" distL="0" distR="0" wp14:anchorId="1FAB8BE7" wp14:editId="33E135DD">
             <wp:extent cx="1800057" cy="2305050"/>
@@ -1550,7 +1573,7 @@
                     <pic:cNvPicPr/>
                   </pic:nvPicPr>
                   <pic:blipFill>
-                    <a:blip r:embed="rId15"/>
+                    <a:blip r:embed="rId16"/>
                     <a:stretch>
                       <a:fillRect/>
                     </a:stretch>
@@ -1607,6 +1630,9 @@
         <w:t xml:space="preserve">Renommer la barre d’outils     </w:t>
       </w:r>
       <w:r>
+        <w:rPr>
+          <w:noProof/>
+        </w:rPr>
         <w:drawing>
           <wp:inline distT="0" distB="0" distL="0" distR="0" wp14:anchorId="03EFC16B" wp14:editId="1FDBE4E3">
             <wp:extent cx="2276793" cy="228632"/>
@@ -1623,7 +1649,7 @@
                     <pic:cNvPicPr/>
                   </pic:nvPicPr>
                   <pic:blipFill>
-                    <a:blip r:embed="rId16"/>
+                    <a:blip r:embed="rId17"/>
                     <a:stretch>
                       <a:fillRect/>
                     </a:stretch>
@@ -1666,7 +1692,7 @@
       <w:r>
         <w:tab/>
       </w:r>
-      <w:bookmarkStart w:id="7" w:name="_Toc224313229"/>
+      <w:bookmarkStart w:id="7" w:name="_Toc227263437"/>
       <w:r>
         <w:t>Suivi des versions et documentation</w:t>
       </w:r>
@@ -1678,6 +1704,9 @@
         <w:ind w:left="576"/>
       </w:pPr>
       <w:r>
+        <w:rPr>
+          <w:noProof/>
+        </w:rPr>
         <w:drawing>
           <wp:inline distT="0" distB="0" distL="0" distR="0" wp14:anchorId="69ED7FD3" wp14:editId="574DAB73">
             <wp:extent cx="285790" cy="209579"/>
@@ -1694,7 +1723,7 @@
                     <pic:cNvPicPr/>
                   </pic:nvPicPr>
                   <pic:blipFill>
-                    <a:blip r:embed="rId17"/>
+                    <a:blip r:embed="rId18"/>
                     <a:stretch>
                       <a:fillRect/>
                     </a:stretch>
@@ -1723,16 +1752,18 @@
         <w:ind w:left="576"/>
       </w:pPr>
     </w:p>
+    <w:bookmarkEnd w:id="4"/>
     <w:p>
       <w:pPr>
         <w:ind w:left="576"/>
+        <w:jc w:val="center"/>
       </w:pPr>
       <w:r>
         <w:drawing>
-          <wp:inline distT="0" distB="0" distL="0" distR="0" wp14:anchorId="1FCFF12C" wp14:editId="5F5E470D">
-            <wp:extent cx="2085975" cy="1607052"/>
-            <wp:effectExtent l="0" t="0" r="0" b="0"/>
-            <wp:docPr id="1879060029" name="Image 1"/>
+          <wp:inline distT="0" distB="0" distL="0" distR="0" wp14:anchorId="5BAE1C76" wp14:editId="4E7A13E1">
+            <wp:extent cx="2743200" cy="2113384"/>
+            <wp:effectExtent l="0" t="0" r="0" b="1270"/>
+            <wp:docPr id="82731521" name="Image 1"/>
             <wp:cNvGraphicFramePr>
               <a:graphicFrameLocks xmlns:a="http://schemas.openxmlformats.org/drawingml/2006/main" noChangeAspect="1"/>
             </wp:cNvGraphicFramePr>
@@ -1740,11 +1771,11 @@
               <a:graphicData uri="http://schemas.openxmlformats.org/drawingml/2006/picture">
                 <pic:pic xmlns:pic="http://schemas.openxmlformats.org/drawingml/2006/picture">
                   <pic:nvPicPr>
-                    <pic:cNvPr id="1879060029" name=""/>
+                    <pic:cNvPr id="82731521" name=""/>
                     <pic:cNvPicPr/>
                   </pic:nvPicPr>
                   <pic:blipFill>
-                    <a:blip r:embed="rId18"/>
+                    <a:blip r:embed="rId19"/>
                     <a:stretch>
                       <a:fillRect/>
                     </a:stretch>
@@ -1752,7 +1783,7 @@
                   <pic:spPr>
                     <a:xfrm>
                       <a:off x="0" y="0"/>
-                      <a:ext cx="2091171" cy="1611055"/>
+                      <a:ext cx="2746036" cy="2115569"/>
                     </a:xfrm>
                     <a:prstGeom prst="rect">
                       <a:avLst/>
@@ -1764,11 +1795,10 @@
           </wp:inline>
         </w:drawing>
       </w:r>
-      <w:bookmarkEnd w:id="4"/>
     </w:p>
     <w:sectPr>
-      <w:footerReference w:type="default" r:id="rId19"/>
-      <w:footerReference w:type="first" r:id="rId20"/>
+      <w:footerReference w:type="default" r:id="rId20"/>
+      <w:footerReference w:type="first" r:id="rId21"/>
       <w:pgSz w:w="11906" w:h="16838" w:code="9"/>
       <w:pgMar w:top="851" w:right="924" w:bottom="1616" w:left="1134" w:header="709" w:footer="607" w:gutter="0"/>
       <w:cols w:space="708"/>
@@ -5267,15 +5297,6 @@
 </file>
 
 <file path=customXml/item1.xml><?xml version="1.0" encoding="utf-8"?>
-<?mso-contentType ?>
-<FormTemplates xmlns="http://schemas.microsoft.com/sharepoint/v3/contenttype/forms">
-  <Display>DocumentLibraryForm</Display>
-  <Edit>DocumentLibraryForm</Edit>
-  <New>DocumentLibraryForm</New>
-</FormTemplates>
-</file>
-
-<file path=customXml/item2.xml><?xml version="1.0" encoding="utf-8"?>
 <p:properties xmlns:p="http://schemas.microsoft.com/office/2006/metadata/properties" xmlns:xsi="http://www.w3.org/2001/XMLSchema-instance" xmlns:pc="http://schemas.microsoft.com/office/infopath/2007/PartnerControls">
   <documentManagement>
     <lcf76f155ced4ddcb4097134ff3c332f xmlns="b295003c-aa87-407e-9024-fdee4e88f6fa">
@@ -5285,11 +5306,16 @@
 </p:properties>
 </file>
 
-<file path=customXml/item3.xml><?xml version="1.0" encoding="utf-8"?>
-<b:Sources xmlns:b="http://schemas.openxmlformats.org/officeDocument/2006/bibliography" xmlns="http://schemas.openxmlformats.org/officeDocument/2006/bibliography" SelectedStyle="\APA.XSL" StyleName="APA"/>
+<file path=customXml/item2.xml><?xml version="1.0" encoding="utf-8"?>
+<?mso-contentType ?>
+<FormTemplates xmlns="http://schemas.microsoft.com/sharepoint/v3/contenttype/forms">
+  <Display>DocumentLibraryForm</Display>
+  <Edit>DocumentLibraryForm</Edit>
+  <New>DocumentLibraryForm</New>
+</FormTemplates>
 </file>
 
-<file path=customXml/item4.xml><?xml version="1.0" encoding="utf-8"?>
+<file path=customXml/item3.xml><?xml version="1.0" encoding="utf-8"?>
 <ct:contentTypeSchema xmlns:ct="http://schemas.microsoft.com/office/2006/metadata/contentType" xmlns:ma="http://schemas.microsoft.com/office/2006/metadata/properties/metaAttributes" ct:_="" ma:_="" ma:contentTypeName="Document" ma:contentTypeID="0x010100A3FA4CB5114F4B43B99F0B6DC8751D90" ma:contentTypeVersion="10" ma:contentTypeDescription="Crée un document." ma:contentTypeScope="" ma:versionID="501205be520febb413c56432ff8e6df1">
   <xsd:schema xmlns:xsd="http://www.w3.org/2001/XMLSchema" xmlns:xs="http://www.w3.org/2001/XMLSchema" xmlns:p="http://schemas.microsoft.com/office/2006/metadata/properties" xmlns:ns2="b295003c-aa87-407e-9024-fdee4e88f6fa" targetNamespace="http://schemas.microsoft.com/office/2006/metadata/properties" ma:root="true" ma:fieldsID="0378f5bf275aa5e8e5bb75b38d3da7db" ns2:_="">
     <xsd:import namespace="b295003c-aa87-407e-9024-fdee4e88f6fa"/>
@@ -5467,15 +5493,11 @@
 </ct:contentTypeSchema>
 </file>
 
-<file path=customXml/itemProps1.xml><?xml version="1.0" encoding="utf-8"?>
-<ds:datastoreItem xmlns:ds="http://schemas.openxmlformats.org/officeDocument/2006/customXml" ds:itemID="{EEE2973D-7DD7-4773-855D-5CAD81242BDE}">
-  <ds:schemaRefs>
-    <ds:schemaRef ds:uri="http://schemas.microsoft.com/sharepoint/v3/contenttype/forms"/>
-  </ds:schemaRefs>
-</ds:datastoreItem>
+<file path=customXml/item4.xml><?xml version="1.0" encoding="utf-8"?>
+<b:Sources xmlns:b="http://schemas.openxmlformats.org/officeDocument/2006/bibliography" xmlns="http://schemas.openxmlformats.org/officeDocument/2006/bibliography" SelectedStyle="\APA.XSL" StyleName="APA"/>
 </file>
 
-<file path=customXml/itemProps2.xml><?xml version="1.0" encoding="utf-8"?>
+<file path=customXml/itemProps1.xml><?xml version="1.0" encoding="utf-8"?>
 <ds:datastoreItem xmlns:ds="http://schemas.openxmlformats.org/officeDocument/2006/customXml" ds:itemID="{1159403A-C237-488E-8C5E-DABF9FCE7043}">
   <ds:schemaRefs>
     <ds:schemaRef ds:uri="http://schemas.microsoft.com/office/2006/metadata/properties"/>
@@ -5485,15 +5507,15 @@
 </ds:datastoreItem>
 </file>
 
-<file path=customXml/itemProps3.xml><?xml version="1.0" encoding="utf-8"?>
-<ds:datastoreItem xmlns:ds="http://schemas.openxmlformats.org/officeDocument/2006/customXml" ds:itemID="{0FF0F878-5F0F-460C-9013-40E72731A637}">
+<file path=customXml/itemProps2.xml><?xml version="1.0" encoding="utf-8"?>
+<ds:datastoreItem xmlns:ds="http://schemas.openxmlformats.org/officeDocument/2006/customXml" ds:itemID="{EEE2973D-7DD7-4773-855D-5CAD81242BDE}">
   <ds:schemaRefs>
-    <ds:schemaRef ds:uri="http://schemas.openxmlformats.org/officeDocument/2006/bibliography"/>
+    <ds:schemaRef ds:uri="http://schemas.microsoft.com/sharepoint/v3/contenttype/forms"/>
   </ds:schemaRefs>
 </ds:datastoreItem>
 </file>
 
-<file path=customXml/itemProps4.xml><?xml version="1.0" encoding="utf-8"?>
+<file path=customXml/itemProps3.xml><?xml version="1.0" encoding="utf-8"?>
 <ds:datastoreItem xmlns:ds="http://schemas.openxmlformats.org/officeDocument/2006/customXml" ds:itemID="{74BB8944-94E5-4D6E-A806-EDC8D9D698A5}">
   <ds:schemaRefs>
     <ds:schemaRef ds:uri="http://schemas.microsoft.com/office/2006/metadata/contentType"/>
@@ -5509,4 +5531,12 @@
     <ds:schemaRef ds:uri="http://schemas.microsoft.com/internal/obd"/>
   </ds:schemaRefs>
 </ds:datastoreItem>
+</file>
+
+<file path=customXml/itemProps4.xml><?xml version="1.0" encoding="utf-8"?>
+<ds:datastoreItem xmlns:ds="http://schemas.openxmlformats.org/officeDocument/2006/customXml" ds:itemID="{0FF0F878-5F0F-460C-9013-40E72731A637}">
+  <ds:schemaRefs>
+    <ds:schemaRef ds:uri="http://schemas.openxmlformats.org/officeDocument/2006/bibliography"/>
+  </ds:schemaRefs>
+</ds:datastoreItem>
 </file>
</xml_diff>

<commit_message>
installation du package pefile si besoin
</commit_message>
<xml_diff>
--- a/plugin_maitre.docx
+++ b/plugin_maitre.docx
@@ -145,7 +145,7 @@
                 <w:sz w:val="28"/>
                 <w:szCs w:val="28"/>
               </w:rPr>
-              <w:t>5</w:t>
+              <w:t>6</w:t>
             </w:r>
             <w:r>
               <w:rPr>
@@ -327,7 +327,7 @@
           <w:r>
             <w:fldChar w:fldCharType="separate"/>
           </w:r>
-          <w:hyperlink w:anchor="_Toc227263431" w:history="1">
+          <w:hyperlink w:anchor="_Toc227373252" w:history="1">
             <w:r>
               <w:rPr>
                 <w:rStyle w:val="Lienhypertexte"/>
@@ -367,7 +367,7 @@
               <w:rPr>
                 <w:webHidden/>
               </w:rPr>
-              <w:instrText xml:space="preserve"> PAGEREF _Toc227263431 \h </w:instrText>
+              <w:instrText xml:space="preserve"> PAGEREF _Toc227373252 \h </w:instrText>
             </w:r>
             <w:r>
               <w:rPr>
@@ -406,7 +406,7 @@
               <w14:ligatures w14:val="standardContextual"/>
             </w:rPr>
           </w:pPr>
-          <w:hyperlink w:anchor="_Toc227263432" w:history="1">
+          <w:hyperlink w:anchor="_Toc227373253" w:history="1">
             <w:r>
               <w:rPr>
                 <w:rStyle w:val="Lienhypertexte"/>
@@ -446,7 +446,7 @@
               <w:rPr>
                 <w:webHidden/>
               </w:rPr>
-              <w:instrText xml:space="preserve"> PAGEREF _Toc227263432 \h </w:instrText>
+              <w:instrText xml:space="preserve"> PAGEREF _Toc227373253 \h </w:instrText>
             </w:r>
             <w:r>
               <w:rPr>
@@ -485,7 +485,7 @@
               <w14:ligatures w14:val="standardContextual"/>
             </w:rPr>
           </w:pPr>
-          <w:hyperlink w:anchor="_Toc227263433" w:history="1">
+          <w:hyperlink w:anchor="_Toc227373254" w:history="1">
             <w:r>
               <w:rPr>
                 <w:rStyle w:val="Lienhypertexte"/>
@@ -525,7 +525,7 @@
               <w:rPr>
                 <w:webHidden/>
               </w:rPr>
-              <w:instrText xml:space="preserve"> PAGEREF _Toc227263433 \h </w:instrText>
+              <w:instrText xml:space="preserve"> PAGEREF _Toc227373254 \h </w:instrText>
             </w:r>
             <w:r>
               <w:rPr>
@@ -564,7 +564,7 @@
               <w14:ligatures w14:val="standardContextual"/>
             </w:rPr>
           </w:pPr>
-          <w:hyperlink w:anchor="_Toc227263434" w:history="1">
+          <w:hyperlink w:anchor="_Toc227373255" w:history="1">
             <w:r>
               <w:rPr>
                 <w:rStyle w:val="Lienhypertexte"/>
@@ -604,7 +604,7 @@
               <w:rPr>
                 <w:webHidden/>
               </w:rPr>
-              <w:instrText xml:space="preserve"> PAGEREF _Toc227263434 \h </w:instrText>
+              <w:instrText xml:space="preserve"> PAGEREF _Toc227373255 \h </w:instrText>
             </w:r>
             <w:r>
               <w:rPr>
@@ -642,7 +642,7 @@
               <w14:ligatures w14:val="standardContextual"/>
             </w:rPr>
           </w:pPr>
-          <w:hyperlink w:anchor="_Toc227263435" w:history="1">
+          <w:hyperlink w:anchor="_Toc227373256" w:history="1">
             <w:r>
               <w:rPr>
                 <w:rStyle w:val="Lienhypertexte"/>
@@ -681,7 +681,7 @@
               <w:rPr>
                 <w:webHidden/>
               </w:rPr>
-              <w:instrText xml:space="preserve"> PAGEREF _Toc227263435 \h </w:instrText>
+              <w:instrText xml:space="preserve"> PAGEREF _Toc227373256 \h </w:instrText>
             </w:r>
             <w:r>
               <w:rPr>
@@ -719,7 +719,7 @@
               <w14:ligatures w14:val="standardContextual"/>
             </w:rPr>
           </w:pPr>
-          <w:hyperlink w:anchor="_Toc227263436" w:history="1">
+          <w:hyperlink w:anchor="_Toc227373257" w:history="1">
             <w:r>
               <w:rPr>
                 <w:rStyle w:val="Lienhypertexte"/>
@@ -758,7 +758,7 @@
               <w:rPr>
                 <w:webHidden/>
               </w:rPr>
-              <w:instrText xml:space="preserve"> PAGEREF _Toc227263436 \h </w:instrText>
+              <w:instrText xml:space="preserve"> PAGEREF _Toc227373257 \h </w:instrText>
             </w:r>
             <w:r>
               <w:rPr>
@@ -796,7 +796,7 @@
               <w14:ligatures w14:val="standardContextual"/>
             </w:rPr>
           </w:pPr>
-          <w:hyperlink w:anchor="_Toc227263437" w:history="1">
+          <w:hyperlink w:anchor="_Toc227373258" w:history="1">
             <w:r>
               <w:rPr>
                 <w:rStyle w:val="Lienhypertexte"/>
@@ -835,7 +835,7 @@
               <w:rPr>
                 <w:webHidden/>
               </w:rPr>
-              <w:instrText xml:space="preserve"> PAGEREF _Toc227263437 \h </w:instrText>
+              <w:instrText xml:space="preserve"> PAGEREF _Toc227373258 \h </w:instrText>
             </w:r>
             <w:r>
               <w:rPr>
@@ -890,7 +890,7 @@
       <w:pPr>
         <w:pStyle w:val="Titre1"/>
       </w:pPr>
-      <w:bookmarkStart w:id="0" w:name="_Toc227263431"/>
+      <w:bookmarkStart w:id="0" w:name="_Toc227373252"/>
       <w:r>
         <w:t>Prérequis</w:t>
       </w:r>
@@ -928,7 +928,7 @@
       <w:pPr>
         <w:pStyle w:val="Titre1"/>
       </w:pPr>
-      <w:bookmarkStart w:id="1" w:name="_Toc227263432"/>
+      <w:bookmarkStart w:id="1" w:name="_Toc227373253"/>
       <w:r>
         <w:t>Résumé</w:t>
       </w:r>
@@ -977,7 +977,7 @@
       <w:pPr>
         <w:pStyle w:val="Titre1"/>
       </w:pPr>
-      <w:bookmarkStart w:id="2" w:name="_Toc227263433"/>
+      <w:bookmarkStart w:id="2" w:name="_Toc227373254"/>
       <w:r>
         <w:lastRenderedPageBreak/>
         <w:t>Installation</w:t>
@@ -990,17 +990,42 @@
         <w:t xml:space="preserve">Le plugin Maitre s’installe avec l’exécutable </w:t>
       </w:r>
       <w:r>
-        <w:t>d’installation.</w:t>
+        <w:t>d’installation</w:t>
+      </w:r>
+      <w:r>
+        <w:t xml:space="preserve"> (*_</w:t>
+      </w:r>
+      <w:proofErr w:type="spellStart"/>
+      <w:r>
+        <w:t>PluginIGN_installer</w:t>
+      </w:r>
+      <w:proofErr w:type="spellEnd"/>
+      <w:r>
+        <w:t> »</w:t>
       </w:r>
     </w:p>
     <w:p>
       <w:r>
-        <w:t>Le plugin détecte si des packages indispensables ne sont pas installés.</w:t>
+        <w:t xml:space="preserve">Le plugin </w:t>
+      </w:r>
+      <w:r>
+        <w:t>a besoin du package « </w:t>
+      </w:r>
+      <w:proofErr w:type="spellStart"/>
+      <w:r>
+        <w:t>pefile</w:t>
+      </w:r>
+      <w:proofErr w:type="spellEnd"/>
+      <w:r>
+        <w:t> » pour tester la mise à jour de l’installateur</w:t>
+      </w:r>
+      <w:r>
+        <w:t>.</w:t>
       </w:r>
     </w:p>
     <w:p>
       <w:r>
-        <w:t xml:space="preserve">Si c’est le cas on obtient au lancement du plugin : </w:t>
+        <w:t>Si ce package n’est pas installé le plugin maitre propose de l’installer :</w:t>
       </w:r>
     </w:p>
     <w:p>
@@ -1009,10 +1034,10 @@
       </w:pPr>
       <w:r>
         <w:drawing>
-          <wp:inline distT="0" distB="0" distL="0" distR="0" wp14:anchorId="38E0E19A" wp14:editId="71454AD0">
-            <wp:extent cx="2562225" cy="1727182"/>
-            <wp:effectExtent l="0" t="0" r="0" b="6985"/>
-            <wp:docPr id="1386316930" name="Image 1"/>
+          <wp:inline distT="0" distB="0" distL="0" distR="0" wp14:anchorId="5A3C5B82" wp14:editId="50AC6B4D">
+            <wp:extent cx="2371725" cy="1078057"/>
+            <wp:effectExtent l="0" t="0" r="0" b="8255"/>
+            <wp:docPr id="713365982" name="Image 1"/>
             <wp:cNvGraphicFramePr>
               <a:graphicFrameLocks xmlns:a="http://schemas.openxmlformats.org/drawingml/2006/main" noChangeAspect="1"/>
             </wp:cNvGraphicFramePr>
@@ -1020,7 +1045,7 @@
               <a:graphicData uri="http://schemas.openxmlformats.org/drawingml/2006/picture">
                 <pic:pic xmlns:pic="http://schemas.openxmlformats.org/drawingml/2006/picture">
                   <pic:nvPicPr>
-                    <pic:cNvPr id="1386316930" name=""/>
+                    <pic:cNvPr id="713365982" name=""/>
                     <pic:cNvPicPr/>
                   </pic:nvPicPr>
                   <pic:blipFill>
@@ -1032,7 +1057,7 @@
                   <pic:spPr>
                     <a:xfrm>
                       <a:off x="0" y="0"/>
-                      <a:ext cx="2569452" cy="1732054"/>
+                      <a:ext cx="2375748" cy="1079886"/>
                     </a:xfrm>
                     <a:prstGeom prst="rect">
                       <a:avLst/>
@@ -1045,10 +1070,22 @@
         </w:drawing>
       </w:r>
     </w:p>
-    <w:p/>
     <w:p>
       <w:r>
-        <w:t>Demandez à votre responsable informatique d’installer ces packages.</w:t>
+        <w:t>Si on choisit de ne pas l’installer ce n’est pas bloquant mais si une mise à jour de l’installateur est disponible, elle ne pourra pas s’installer.</w:t>
+      </w:r>
+    </w:p>
+    <w:p>
+      <w:r>
+        <w:t>Si on choisit d’installer le package « </w:t>
+      </w:r>
+      <w:proofErr w:type="spellStart"/>
+      <w:r>
+        <w:t>pefile</w:t>
+      </w:r>
+      <w:proofErr w:type="spellEnd"/>
+      <w:r>
+        <w:t> » il est primordial à la fin de l’installation de redémarrer QGIS pour que ce package soit prit en compte.</w:t>
       </w:r>
     </w:p>
     <w:p/>
@@ -1056,7 +1093,7 @@
       <w:pPr>
         <w:pStyle w:val="Titre1"/>
       </w:pPr>
-      <w:bookmarkStart w:id="3" w:name="_Toc227263434"/>
+      <w:bookmarkStart w:id="3" w:name="_Toc227373255"/>
       <w:r>
         <w:t>Présentation</w:t>
       </w:r>
@@ -1073,6 +1110,9 @@
         <w:jc w:val="center"/>
       </w:pPr>
       <w:r>
+        <w:rPr>
+          <w:noProof/>
+        </w:rPr>
         <w:drawing>
           <wp:inline distT="0" distB="0" distL="0" distR="0" wp14:anchorId="74D3E6B5" wp14:editId="2698802C">
             <wp:extent cx="3295650" cy="2665407"/>
@@ -1133,7 +1173,7 @@
       <w:pPr>
         <w:pStyle w:val="Titre2"/>
       </w:pPr>
-      <w:bookmarkStart w:id="5" w:name="_Toc227263435"/>
+      <w:bookmarkStart w:id="5" w:name="_Toc227373256"/>
       <w:r>
         <w:t>Onglet menu IGN</w:t>
       </w:r>
@@ -1177,7 +1217,7 @@
       <w:pPr>
         <w:pStyle w:val="Titre2"/>
       </w:pPr>
-      <w:bookmarkStart w:id="6" w:name="_Toc227263436"/>
+      <w:bookmarkStart w:id="6" w:name="_Toc227373257"/>
       <w:r>
         <w:t>Barres d’outils</w:t>
       </w:r>
@@ -1692,7 +1732,7 @@
       <w:r>
         <w:tab/>
       </w:r>
-      <w:bookmarkStart w:id="7" w:name="_Toc227263437"/>
+      <w:bookmarkStart w:id="7" w:name="_Toc227373258"/>
       <w:r>
         <w:t>Suivi des versions et documentation</w:t>
       </w:r>
@@ -1760,10 +1800,10 @@
       </w:pPr>
       <w:r>
         <w:drawing>
-          <wp:inline distT="0" distB="0" distL="0" distR="0" wp14:anchorId="5BAE1C76" wp14:editId="4E7A13E1">
-            <wp:extent cx="2743200" cy="2113384"/>
-            <wp:effectExtent l="0" t="0" r="0" b="1270"/>
-            <wp:docPr id="82731521" name="Image 1"/>
+          <wp:inline distT="0" distB="0" distL="0" distR="0" wp14:anchorId="40487EBD" wp14:editId="4C7FE3A4">
+            <wp:extent cx="2876550" cy="2803169"/>
+            <wp:effectExtent l="0" t="0" r="0" b="0"/>
+            <wp:docPr id="1123442834" name="Image 1"/>
             <wp:cNvGraphicFramePr>
               <a:graphicFrameLocks xmlns:a="http://schemas.openxmlformats.org/drawingml/2006/main" noChangeAspect="1"/>
             </wp:cNvGraphicFramePr>
@@ -1771,7 +1811,7 @@
               <a:graphicData uri="http://schemas.openxmlformats.org/drawingml/2006/picture">
                 <pic:pic xmlns:pic="http://schemas.openxmlformats.org/drawingml/2006/picture">
                   <pic:nvPicPr>
-                    <pic:cNvPr id="82731521" name=""/>
+                    <pic:cNvPr id="1123442834" name=""/>
                     <pic:cNvPicPr/>
                   </pic:nvPicPr>
                   <pic:blipFill>
@@ -1783,7 +1823,7 @@
                   <pic:spPr>
                     <a:xfrm>
                       <a:off x="0" y="0"/>
-                      <a:ext cx="2746036" cy="2115569"/>
+                      <a:ext cx="2878700" cy="2805264"/>
                     </a:xfrm>
                     <a:prstGeom prst="rect">
                       <a:avLst/>
@@ -5297,6 +5337,15 @@
 </file>
 
 <file path=customXml/item1.xml><?xml version="1.0" encoding="utf-8"?>
+<?mso-contentType ?>
+<FormTemplates xmlns="http://schemas.microsoft.com/sharepoint/v3/contenttype/forms">
+  <Display>DocumentLibraryForm</Display>
+  <Edit>DocumentLibraryForm</Edit>
+  <New>DocumentLibraryForm</New>
+</FormTemplates>
+</file>
+
+<file path=customXml/item2.xml><?xml version="1.0" encoding="utf-8"?>
 <p:properties xmlns:p="http://schemas.microsoft.com/office/2006/metadata/properties" xmlns:xsi="http://www.w3.org/2001/XMLSchema-instance" xmlns:pc="http://schemas.microsoft.com/office/infopath/2007/PartnerControls">
   <documentManagement>
     <lcf76f155ced4ddcb4097134ff3c332f xmlns="b295003c-aa87-407e-9024-fdee4e88f6fa">
@@ -5306,16 +5355,11 @@
 </p:properties>
 </file>
 
-<file path=customXml/item2.xml><?xml version="1.0" encoding="utf-8"?>
-<?mso-contentType ?>
-<FormTemplates xmlns="http://schemas.microsoft.com/sharepoint/v3/contenttype/forms">
-  <Display>DocumentLibraryForm</Display>
-  <Edit>DocumentLibraryForm</Edit>
-  <New>DocumentLibraryForm</New>
-</FormTemplates>
+<file path=customXml/item3.xml><?xml version="1.0" encoding="utf-8"?>
+<b:Sources xmlns:b="http://schemas.openxmlformats.org/officeDocument/2006/bibliography" xmlns="http://schemas.openxmlformats.org/officeDocument/2006/bibliography" SelectedStyle="\APA.XSL" StyleName="APA"/>
 </file>
 
-<file path=customXml/item3.xml><?xml version="1.0" encoding="utf-8"?>
+<file path=customXml/item4.xml><?xml version="1.0" encoding="utf-8"?>
 <ct:contentTypeSchema xmlns:ct="http://schemas.microsoft.com/office/2006/metadata/contentType" xmlns:ma="http://schemas.microsoft.com/office/2006/metadata/properties/metaAttributes" ct:_="" ma:_="" ma:contentTypeName="Document" ma:contentTypeID="0x010100A3FA4CB5114F4B43B99F0B6DC8751D90" ma:contentTypeVersion="10" ma:contentTypeDescription="Crée un document." ma:contentTypeScope="" ma:versionID="501205be520febb413c56432ff8e6df1">
   <xsd:schema xmlns:xsd="http://www.w3.org/2001/XMLSchema" xmlns:xs="http://www.w3.org/2001/XMLSchema" xmlns:p="http://schemas.microsoft.com/office/2006/metadata/properties" xmlns:ns2="b295003c-aa87-407e-9024-fdee4e88f6fa" targetNamespace="http://schemas.microsoft.com/office/2006/metadata/properties" ma:root="true" ma:fieldsID="0378f5bf275aa5e8e5bb75b38d3da7db" ns2:_="">
     <xsd:import namespace="b295003c-aa87-407e-9024-fdee4e88f6fa"/>
@@ -5493,11 +5537,15 @@
 </ct:contentTypeSchema>
 </file>
 
-<file path=customXml/item4.xml><?xml version="1.0" encoding="utf-8"?>
-<b:Sources xmlns:b="http://schemas.openxmlformats.org/officeDocument/2006/bibliography" xmlns="http://schemas.openxmlformats.org/officeDocument/2006/bibliography" SelectedStyle="\APA.XSL" StyleName="APA"/>
+<file path=customXml/itemProps1.xml><?xml version="1.0" encoding="utf-8"?>
+<ds:datastoreItem xmlns:ds="http://schemas.openxmlformats.org/officeDocument/2006/customXml" ds:itemID="{EEE2973D-7DD7-4773-855D-5CAD81242BDE}">
+  <ds:schemaRefs>
+    <ds:schemaRef ds:uri="http://schemas.microsoft.com/sharepoint/v3/contenttype/forms"/>
+  </ds:schemaRefs>
+</ds:datastoreItem>
 </file>
 
-<file path=customXml/itemProps1.xml><?xml version="1.0" encoding="utf-8"?>
+<file path=customXml/itemProps2.xml><?xml version="1.0" encoding="utf-8"?>
 <ds:datastoreItem xmlns:ds="http://schemas.openxmlformats.org/officeDocument/2006/customXml" ds:itemID="{1159403A-C237-488E-8C5E-DABF9FCE7043}">
   <ds:schemaRefs>
     <ds:schemaRef ds:uri="http://schemas.microsoft.com/office/2006/metadata/properties"/>
@@ -5507,15 +5555,15 @@
 </ds:datastoreItem>
 </file>
 
-<file path=customXml/itemProps2.xml><?xml version="1.0" encoding="utf-8"?>
-<ds:datastoreItem xmlns:ds="http://schemas.openxmlformats.org/officeDocument/2006/customXml" ds:itemID="{EEE2973D-7DD7-4773-855D-5CAD81242BDE}">
+<file path=customXml/itemProps3.xml><?xml version="1.0" encoding="utf-8"?>
+<ds:datastoreItem xmlns:ds="http://schemas.openxmlformats.org/officeDocument/2006/customXml" ds:itemID="{0FF0F878-5F0F-460C-9013-40E72731A637}">
   <ds:schemaRefs>
-    <ds:schemaRef ds:uri="http://schemas.microsoft.com/sharepoint/v3/contenttype/forms"/>
+    <ds:schemaRef ds:uri="http://schemas.openxmlformats.org/officeDocument/2006/bibliography"/>
   </ds:schemaRefs>
 </ds:datastoreItem>
 </file>
 
-<file path=customXml/itemProps3.xml><?xml version="1.0" encoding="utf-8"?>
+<file path=customXml/itemProps4.xml><?xml version="1.0" encoding="utf-8"?>
 <ds:datastoreItem xmlns:ds="http://schemas.openxmlformats.org/officeDocument/2006/customXml" ds:itemID="{74BB8944-94E5-4D6E-A806-EDC8D9D698A5}">
   <ds:schemaRefs>
     <ds:schemaRef ds:uri="http://schemas.microsoft.com/office/2006/metadata/contentType"/>
@@ -5531,12 +5579,4 @@
     <ds:schemaRef ds:uri="http://schemas.microsoft.com/internal/obd"/>
   </ds:schemaRefs>
 </ds:datastoreItem>
-</file>
-
-<file path=customXml/itemProps4.xml><?xml version="1.0" encoding="utf-8"?>
-<ds:datastoreItem xmlns:ds="http://schemas.openxmlformats.org/officeDocument/2006/customXml" ds:itemID="{0FF0F878-5F0F-460C-9013-40E72731A637}">
-  <ds:schemaRefs>
-    <ds:schemaRef ds:uri="http://schemas.openxmlformats.org/officeDocument/2006/bibliography"/>
-  </ds:schemaRefs>
-</ds:datastoreItem>
 </file>
</xml_diff>